<commit_message>
Embed figures and data tables directly into the manuscript
Add a Figure Legends section with all 5 main figures embedded inline
(previously only cited in text, never rendered), insert the full
21-locus donor-aware results table into Section 3.5, and rewrite the
markdown-to-docx converter to actually render pipe-tables as native
Word tables and markdown images as embedded pictures instead of
silently skipping both. Recover two QC/UMAP figures that were
referenced by the figure guide but missing from results/figures/.
Reconcile the Supplementary Material list with the real files present
in results/supplementary_figures/, and demote the pattern-based (non-
GENCODE-reverified) cell-type-specificity figure out of the main text.
</commit_message>
<xml_diff>
--- a/manuscript/manuscript.docx
+++ b/manuscript/manuscript.docx
@@ -347,7 +347,16 @@
     </w:p>
     <w:p>
       <w:r>
-        <w:t>After quality control, 209,289 PBMCs were retained across the 9 analytical donors (median 22,706 cells/donor). Harmony integration removed inter-donor batch structure while preserving biological variation (Supplementary Fig. S1). Seven broad PBMC populations were identified by proportion: T cells, NK cells, monocytes, B cells, platelets, dendritic cells, and HSPCs.</w:t>
+        <w:t>After quality control, 209,289 PBMCs were retained across the 9 analytical donors (median 22,706 cells/donor). Harmony integration removed inter-donor batch structure while preserving biological variation (</w:t>
+      </w:r>
+      <w:r>
+        <w:rPr>
+          <w:b/>
+        </w:rPr>
+        <w:t>Fig. 1</w:t>
+      </w:r>
+      <w:r>
+        <w:t>). Seven broad PBMC populations were identified by proportion: T cells, NK cells, monocytes, B cells, platelets, dendritic cells, and HSPCs.</w:t>
       </w:r>
     </w:p>
     <w:p>
@@ -373,7 +382,25 @@
     </w:p>
     <w:p>
       <w:r>
-        <w:t>Diffusion pseudotime placed CD14 Classical at the root (median pseudotime 0.013), CD16 Non-Classical close by (0.146), and Intermediate maximally distant (0.840) (Fig. 2B–C) — already inconsistent with Intermediate lying "between" the other two states on a linear axis. PAGA connectivity analysis made this explicit (Fig. 2D, new): CD14↔CD16 connectivity (0.044) was more than three times stronger than CD14↔Intermediate connectivity (0.012), with Intermediate↔CD16 intermediate (0.020). We interpret this as a shared-origin, divergent-branch topology — CD14 Classical monocytes as an origin state giving rise to a closely related CD16 Non-Classical maturation programme and a more transcriptionally distinct Intermediate state — rather than a linear activation continuum, consistent with prior characterization of intermediate monocytes as a distinct activated state [19].</w:t>
+        <w:t>Diffusion pseudotime placed CD14 Classical at the root (median pseudotime 0.013), CD16 Non-Classical close by (0.146), and Intermediate maximally distant (0.840) (</w:t>
+      </w:r>
+      <w:r>
+        <w:rPr>
+          <w:b/>
+        </w:rPr>
+        <w:t>Fig. 2B–C</w:t>
+      </w:r>
+      <w:r>
+        <w:t>) — already inconsistent with Intermediate lying "between" the other two states on a linear axis. PAGA connectivity analysis made this explicit (</w:t>
+      </w:r>
+      <w:r>
+        <w:rPr>
+          <w:b/>
+        </w:rPr>
+        <w:t>Fig. 2D</w:t>
+      </w:r>
+      <w:r>
+        <w:t>): CD14↔CD16 connectivity (0.044) was more than three times stronger than CD14↔Intermediate connectivity (0.012), with Intermediate↔CD16 intermediate (0.020). We interpret this as a shared-origin, divergent-branch topology — CD14 Classical monocytes as an origin state giving rise to a closely related CD16 Non-Classical maturation programme and a more transcriptionally distinct Intermediate state — rather than a linear activation continuum, consistent with prior characterization of intermediate monocytes as a distinct activated state [19].</w:t>
       </w:r>
     </w:p>
     <w:p>
@@ -399,7 +426,16 @@
     </w:p>
     <w:p>
       <w:r>
-        <w:t xml:space="preserve">Under the donor-aware statistic, 21 of the 22 GENCODE-confirmed candidates remained significant (donor-aware |ρ| range 0.155–0.371, all FDR&lt;0.001, unanimous direction agreement across all 9 donors for every retained locus); SNHG12 was downgraded (donor-aware |ρ|=0.135, below the pre-specified 0.15 threshold). An unbiased donor-aware screen of all 481 GENCODE-confirmed, adequately-detected lncRNAs identified </w:t>
+        <w:t>Under the donor-aware statistic, 21 of the 22 GENCODE-confirmed candidates remained significant (donor-aware |ρ| range 0.155–0.371, all FDR&lt;0.001, unanimous direction agreement across all 9 donors for every retained locus); SNHG12 was downgraded (donor-aware |ρ|=0.135, below the pre-specified 0.15 threshold) (</w:t>
+      </w:r>
+      <w:r>
+        <w:rPr>
+          <w:b/>
+        </w:rPr>
+        <w:t>Table 1</w:t>
+      </w:r>
+      <w:r>
+        <w:t xml:space="preserve">). An unbiased donor-aware screen of all 481 GENCODE-confirmed, adequately-detected lncRNAs identified </w:t>
       </w:r>
       <w:r>
         <w:rPr>
@@ -408,7 +444,2488 @@
         <w:t>28 significant loci</w:t>
       </w:r>
       <w:r>
-        <w:t xml:space="preserve"> in total, 7 of which were not present in the original pattern-based screen: PCED1B-AS1, ATP2B1-AS1, SMIM25, LUCAT1, C5orf56, PRKCQ-AS1, and AP000547.3 (Supplementary Table S1). These 7 have not been individually validated in the bulk cohort and are reported as a discovery-stage resource. Eight lncRNAs were enriched toward CD14 Classical monocytes (negative ρ), including NEAT1 (ρ=−0.259) and AC020656.1 (ρ=−0.335); the remainder were enriched toward CD16 Non-Classical monocytes, including MALAT1 (ρ=+0.371) and LINC00861 (ρ=+0.225).</w:t>
+        <w:t xml:space="preserve"> in total, 7 of which were not present in the original pattern-based screen: PCED1B-AS1, ATP2B1-AS1, SMIM25, LUCAT1, C5orf56, PRKCQ-AS1, and AP000547.3 (Supplementary Table S1). These 7 have not been individually validated in the bulk cohort and are reported as a discovery-stage resource. Eight lncRNAs were enriched toward CD14 Classical monocytes (negative ρ), including NEAT1 (ρ=−0.259) and AC020656.1 (ρ=−0.335); the remainder were enriched toward CD16 Non-Classical monocytes, including MALAT1 (ρ=+0.371) and LINC00861 (ρ=+0.225) (</w:t>
+      </w:r>
+      <w:r>
+        <w:rPr>
+          <w:b/>
+        </w:rPr>
+        <w:t>Fig. 3</w:t>
+      </w:r>
+      <w:r>
+        <w:t>).</w:t>
+      </w:r>
+    </w:p>
+    <w:p>
+      <w:r>
+        <w:rPr>
+          <w:b/>
+        </w:rPr>
+        <w:t>Table 1. Donor-aware trajectory-associated lncRNAs (21 of 22 GENCODE-confirmed candidates), ranked by effect size.</w:t>
+      </w:r>
+      <w:r>
+        <w:t xml:space="preserve"> Direction indicates which monocyte subtype shows higher expression. Bulk log₂FC/FDR are from the independent GSE221521 validation cohort (T2D vs. Control, Welch's t-test, BH-corrected across the 20-gene pre-specified panel); "—" indicates the gene was not detected in the bulk dataset. AC119396.1 and GAS7 (originally flagged by the pattern-matching screen) are excluded here as GENCODE v32-confirmed protein-coding genes; SNHG12 is excluded as it did not meet the |ρ|≥0.15 threshold under donor-aware statistics.</w:t>
+      </w:r>
+    </w:p>
+    <w:tbl>
+      <w:tblPr>
+        <w:tblStyle w:val="LightGrid-Accent1"/>
+        <w:tblW w:type="auto" w:w="0"/>
+        <w:jc w:val="center"/>
+        <w:tblLook w:firstColumn="1" w:firstRow="1" w:lastColumn="0" w:lastRow="0" w:noHBand="0" w:noVBand="1" w:val="04A0"/>
+      </w:tblPr>
+      <w:tblGrid>
+        <w:gridCol w:w="1440"/>
+        <w:gridCol w:w="1440"/>
+        <w:gridCol w:w="1440"/>
+        <w:gridCol w:w="1440"/>
+        <w:gridCol w:w="1440"/>
+        <w:gridCol w:w="1440"/>
+      </w:tblGrid>
+      <w:tr>
+        <w:tc>
+          <w:tcPr>
+            <w:tcW w:type="dxa" w:w="1440"/>
+            <w:shd w:fill="D9E2F3"/>
+          </w:tcPr>
+          <w:p>
+            <w:r>
+              <w:rPr>
+                <w:b/>
+                <w:sz w:val="19"/>
+              </w:rPr>
+            </w:r>
+            <w:r>
+              <w:rPr>
+                <w:b/>
+                <w:sz w:val="19"/>
+              </w:rPr>
+              <w:t>Gene</w:t>
+            </w:r>
+          </w:p>
+        </w:tc>
+        <w:tc>
+          <w:tcPr>
+            <w:tcW w:type="dxa" w:w="1440"/>
+            <w:shd w:fill="D9E2F3"/>
+          </w:tcPr>
+          <w:p>
+            <w:r>
+              <w:rPr>
+                <w:b/>
+                <w:sz w:val="19"/>
+              </w:rPr>
+            </w:r>
+            <w:r>
+              <w:rPr>
+                <w:b/>
+                <w:sz w:val="19"/>
+              </w:rPr>
+              <w:t>Donor-aware ρ</w:t>
+            </w:r>
+          </w:p>
+        </w:tc>
+        <w:tc>
+          <w:tcPr>
+            <w:tcW w:type="dxa" w:w="1440"/>
+            <w:shd w:fill="D9E2F3"/>
+          </w:tcPr>
+          <w:p>
+            <w:r>
+              <w:rPr>
+                <w:b/>
+                <w:sz w:val="19"/>
+              </w:rPr>
+            </w:r>
+            <w:r>
+              <w:rPr>
+                <w:b/>
+                <w:sz w:val="19"/>
+              </w:rPr>
+              <w:t>FDR</w:t>
+            </w:r>
+          </w:p>
+        </w:tc>
+        <w:tc>
+          <w:tcPr>
+            <w:tcW w:type="dxa" w:w="1440"/>
+            <w:shd w:fill="D9E2F3"/>
+          </w:tcPr>
+          <w:p>
+            <w:r>
+              <w:rPr>
+                <w:b/>
+                <w:sz w:val="19"/>
+              </w:rPr>
+            </w:r>
+            <w:r>
+              <w:rPr>
+                <w:b/>
+                <w:sz w:val="19"/>
+              </w:rPr>
+              <w:t>Direction</w:t>
+            </w:r>
+          </w:p>
+        </w:tc>
+        <w:tc>
+          <w:tcPr>
+            <w:tcW w:type="dxa" w:w="1440"/>
+            <w:shd w:fill="D9E2F3"/>
+          </w:tcPr>
+          <w:p>
+            <w:r>
+              <w:rPr>
+                <w:b/>
+                <w:sz w:val="19"/>
+              </w:rPr>
+            </w:r>
+            <w:r>
+              <w:rPr>
+                <w:b/>
+                <w:sz w:val="19"/>
+              </w:rPr>
+              <w:t>Bulk log₂FC</w:t>
+            </w:r>
+          </w:p>
+        </w:tc>
+        <w:tc>
+          <w:tcPr>
+            <w:tcW w:type="dxa" w:w="1440"/>
+            <w:shd w:fill="D9E2F3"/>
+          </w:tcPr>
+          <w:p>
+            <w:r>
+              <w:rPr>
+                <w:b/>
+                <w:sz w:val="19"/>
+              </w:rPr>
+            </w:r>
+            <w:r>
+              <w:rPr>
+                <w:b/>
+                <w:sz w:val="19"/>
+              </w:rPr>
+              <w:t>Bulk FDR</w:t>
+            </w:r>
+          </w:p>
+        </w:tc>
+      </w:tr>
+      <w:tr>
+        <w:tc>
+          <w:tcPr>
+            <w:tcW w:type="dxa" w:w="1440"/>
+          </w:tcPr>
+          <w:p>
+            <w:r>
+              <w:rPr>
+                <w:sz w:val="19"/>
+              </w:rPr>
+            </w:r>
+            <w:r>
+              <w:rPr>
+                <w:sz w:val="19"/>
+              </w:rPr>
+              <w:t>AC020656.1</w:t>
+            </w:r>
+          </w:p>
+        </w:tc>
+        <w:tc>
+          <w:tcPr>
+            <w:tcW w:type="dxa" w:w="1440"/>
+          </w:tcPr>
+          <w:p>
+            <w:r>
+              <w:rPr>
+                <w:sz w:val="19"/>
+              </w:rPr>
+            </w:r>
+            <w:r>
+              <w:rPr>
+                <w:sz w:val="19"/>
+              </w:rPr>
+              <w:t>−0.335</w:t>
+            </w:r>
+          </w:p>
+        </w:tc>
+        <w:tc>
+          <w:tcPr>
+            <w:tcW w:type="dxa" w:w="1440"/>
+          </w:tcPr>
+          <w:p>
+            <w:r>
+              <w:rPr>
+                <w:sz w:val="19"/>
+              </w:rPr>
+            </w:r>
+            <w:r>
+              <w:rPr>
+                <w:sz w:val="19"/>
+              </w:rPr>
+              <w:t>3.19×10⁻⁶</w:t>
+            </w:r>
+          </w:p>
+        </w:tc>
+        <w:tc>
+          <w:tcPr>
+            <w:tcW w:type="dxa" w:w="1440"/>
+          </w:tcPr>
+          <w:p>
+            <w:r>
+              <w:rPr>
+                <w:sz w:val="19"/>
+              </w:rPr>
+            </w:r>
+            <w:r>
+              <w:rPr>
+                <w:sz w:val="19"/>
+              </w:rPr>
+              <w:t>↑ CD14</w:t>
+            </w:r>
+          </w:p>
+        </w:tc>
+        <w:tc>
+          <w:tcPr>
+            <w:tcW w:type="dxa" w:w="1440"/>
+          </w:tcPr>
+          <w:p>
+            <w:r>
+              <w:rPr>
+                <w:sz w:val="19"/>
+              </w:rPr>
+            </w:r>
+            <w:r>
+              <w:rPr>
+                <w:sz w:val="19"/>
+              </w:rPr>
+              <w:t>+0.75</w:t>
+            </w:r>
+          </w:p>
+        </w:tc>
+        <w:tc>
+          <w:tcPr>
+            <w:tcW w:type="dxa" w:w="1440"/>
+          </w:tcPr>
+          <w:p>
+            <w:r>
+              <w:rPr>
+                <w:sz w:val="19"/>
+              </w:rPr>
+            </w:r>
+            <w:r>
+              <w:rPr>
+                <w:b/>
+                <w:sz w:val="19"/>
+              </w:rPr>
+              <w:t>0.017</w:t>
+            </w:r>
+          </w:p>
+        </w:tc>
+      </w:tr>
+      <w:tr>
+        <w:tc>
+          <w:tcPr>
+            <w:tcW w:type="dxa" w:w="1440"/>
+          </w:tcPr>
+          <w:p>
+            <w:r>
+              <w:rPr>
+                <w:sz w:val="19"/>
+              </w:rPr>
+            </w:r>
+            <w:r>
+              <w:rPr>
+                <w:sz w:val="19"/>
+              </w:rPr>
+              <w:t>MALAT1</w:t>
+            </w:r>
+          </w:p>
+        </w:tc>
+        <w:tc>
+          <w:tcPr>
+            <w:tcW w:type="dxa" w:w="1440"/>
+          </w:tcPr>
+          <w:p>
+            <w:r>
+              <w:rPr>
+                <w:sz w:val="19"/>
+              </w:rPr>
+            </w:r>
+            <w:r>
+              <w:rPr>
+                <w:sz w:val="19"/>
+              </w:rPr>
+              <w:t>+0.371</w:t>
+            </w:r>
+          </w:p>
+        </w:tc>
+        <w:tc>
+          <w:tcPr>
+            <w:tcW w:type="dxa" w:w="1440"/>
+          </w:tcPr>
+          <w:p>
+            <w:r>
+              <w:rPr>
+                <w:sz w:val="19"/>
+              </w:rPr>
+            </w:r>
+            <w:r>
+              <w:rPr>
+                <w:sz w:val="19"/>
+              </w:rPr>
+              <w:t>1.23×10⁻⁵</w:t>
+            </w:r>
+          </w:p>
+        </w:tc>
+        <w:tc>
+          <w:tcPr>
+            <w:tcW w:type="dxa" w:w="1440"/>
+          </w:tcPr>
+          <w:p>
+            <w:r>
+              <w:rPr>
+                <w:sz w:val="19"/>
+              </w:rPr>
+            </w:r>
+            <w:r>
+              <w:rPr>
+                <w:sz w:val="19"/>
+              </w:rPr>
+              <w:t>↑ CD16</w:t>
+            </w:r>
+          </w:p>
+        </w:tc>
+        <w:tc>
+          <w:tcPr>
+            <w:tcW w:type="dxa" w:w="1440"/>
+          </w:tcPr>
+          <w:p>
+            <w:r>
+              <w:rPr>
+                <w:sz w:val="19"/>
+              </w:rPr>
+            </w:r>
+            <w:r>
+              <w:rPr>
+                <w:sz w:val="19"/>
+              </w:rPr>
+              <w:t>+0.10</w:t>
+            </w:r>
+          </w:p>
+        </w:tc>
+        <w:tc>
+          <w:tcPr>
+            <w:tcW w:type="dxa" w:w="1440"/>
+          </w:tcPr>
+          <w:p>
+            <w:r>
+              <w:rPr>
+                <w:sz w:val="19"/>
+              </w:rPr>
+            </w:r>
+            <w:r>
+              <w:rPr>
+                <w:sz w:val="19"/>
+              </w:rPr>
+              <w:t>0.714</w:t>
+            </w:r>
+          </w:p>
+        </w:tc>
+      </w:tr>
+      <w:tr>
+        <w:tc>
+          <w:tcPr>
+            <w:tcW w:type="dxa" w:w="1440"/>
+          </w:tcPr>
+          <w:p>
+            <w:r>
+              <w:rPr>
+                <w:sz w:val="19"/>
+              </w:rPr>
+            </w:r>
+            <w:r>
+              <w:rPr>
+                <w:sz w:val="19"/>
+              </w:rPr>
+              <w:t>AC020916.1</w:t>
+            </w:r>
+          </w:p>
+        </w:tc>
+        <w:tc>
+          <w:tcPr>
+            <w:tcW w:type="dxa" w:w="1440"/>
+          </w:tcPr>
+          <w:p>
+            <w:r>
+              <w:rPr>
+                <w:sz w:val="19"/>
+              </w:rPr>
+            </w:r>
+            <w:r>
+              <w:rPr>
+                <w:sz w:val="19"/>
+              </w:rPr>
+              <w:t>−0.354</w:t>
+            </w:r>
+          </w:p>
+        </w:tc>
+        <w:tc>
+          <w:tcPr>
+            <w:tcW w:type="dxa" w:w="1440"/>
+          </w:tcPr>
+          <w:p>
+            <w:r>
+              <w:rPr>
+                <w:sz w:val="19"/>
+              </w:rPr>
+            </w:r>
+            <w:r>
+              <w:rPr>
+                <w:sz w:val="19"/>
+              </w:rPr>
+              <w:t>2.61×10⁻⁵</w:t>
+            </w:r>
+          </w:p>
+        </w:tc>
+        <w:tc>
+          <w:tcPr>
+            <w:tcW w:type="dxa" w:w="1440"/>
+          </w:tcPr>
+          <w:p>
+            <w:r>
+              <w:rPr>
+                <w:sz w:val="19"/>
+              </w:rPr>
+            </w:r>
+            <w:r>
+              <w:rPr>
+                <w:sz w:val="19"/>
+              </w:rPr>
+              <w:t>↑ CD14</w:t>
+            </w:r>
+          </w:p>
+        </w:tc>
+        <w:tc>
+          <w:tcPr>
+            <w:tcW w:type="dxa" w:w="1440"/>
+          </w:tcPr>
+          <w:p>
+            <w:r>
+              <w:rPr>
+                <w:sz w:val="19"/>
+              </w:rPr>
+            </w:r>
+            <w:r>
+              <w:rPr>
+                <w:sz w:val="19"/>
+              </w:rPr>
+              <w:t>+0.21</w:t>
+            </w:r>
+          </w:p>
+        </w:tc>
+        <w:tc>
+          <w:tcPr>
+            <w:tcW w:type="dxa" w:w="1440"/>
+          </w:tcPr>
+          <w:p>
+            <w:r>
+              <w:rPr>
+                <w:sz w:val="19"/>
+              </w:rPr>
+            </w:r>
+            <w:r>
+              <w:rPr>
+                <w:sz w:val="19"/>
+              </w:rPr>
+              <w:t>0.697</w:t>
+            </w:r>
+          </w:p>
+        </w:tc>
+      </w:tr>
+      <w:tr>
+        <w:tc>
+          <w:tcPr>
+            <w:tcW w:type="dxa" w:w="1440"/>
+          </w:tcPr>
+          <w:p>
+            <w:r>
+              <w:rPr>
+                <w:sz w:val="19"/>
+              </w:rPr>
+            </w:r>
+            <w:r>
+              <w:rPr>
+                <w:sz w:val="19"/>
+              </w:rPr>
+              <w:t>AC104809.2</w:t>
+            </w:r>
+          </w:p>
+        </w:tc>
+        <w:tc>
+          <w:tcPr>
+            <w:tcW w:type="dxa" w:w="1440"/>
+          </w:tcPr>
+          <w:p>
+            <w:r>
+              <w:rPr>
+                <w:sz w:val="19"/>
+              </w:rPr>
+            </w:r>
+            <w:r>
+              <w:rPr>
+                <w:sz w:val="19"/>
+              </w:rPr>
+              <w:t>+0.331</w:t>
+            </w:r>
+          </w:p>
+        </w:tc>
+        <w:tc>
+          <w:tcPr>
+            <w:tcW w:type="dxa" w:w="1440"/>
+          </w:tcPr>
+          <w:p>
+            <w:r>
+              <w:rPr>
+                <w:sz w:val="19"/>
+              </w:rPr>
+            </w:r>
+            <w:r>
+              <w:rPr>
+                <w:sz w:val="19"/>
+              </w:rPr>
+              <w:t>6.16×10⁻⁶</w:t>
+            </w:r>
+          </w:p>
+        </w:tc>
+        <w:tc>
+          <w:tcPr>
+            <w:tcW w:type="dxa" w:w="1440"/>
+          </w:tcPr>
+          <w:p>
+            <w:r>
+              <w:rPr>
+                <w:sz w:val="19"/>
+              </w:rPr>
+            </w:r>
+            <w:r>
+              <w:rPr>
+                <w:sz w:val="19"/>
+              </w:rPr>
+              <w:t>↑ CD16</w:t>
+            </w:r>
+          </w:p>
+        </w:tc>
+        <w:tc>
+          <w:tcPr>
+            <w:tcW w:type="dxa" w:w="1440"/>
+          </w:tcPr>
+          <w:p>
+            <w:r>
+              <w:rPr>
+                <w:sz w:val="19"/>
+              </w:rPr>
+            </w:r>
+            <w:r>
+              <w:rPr>
+                <w:sz w:val="19"/>
+              </w:rPr>
+              <w:t>—</w:t>
+            </w:r>
+          </w:p>
+        </w:tc>
+        <w:tc>
+          <w:tcPr>
+            <w:tcW w:type="dxa" w:w="1440"/>
+          </w:tcPr>
+          <w:p>
+            <w:r>
+              <w:rPr>
+                <w:sz w:val="19"/>
+              </w:rPr>
+            </w:r>
+            <w:r>
+              <w:rPr>
+                <w:sz w:val="19"/>
+              </w:rPr>
+              <w:t>—</w:t>
+            </w:r>
+          </w:p>
+        </w:tc>
+      </w:tr>
+      <w:tr>
+        <w:tc>
+          <w:tcPr>
+            <w:tcW w:type="dxa" w:w="1440"/>
+          </w:tcPr>
+          <w:p>
+            <w:r>
+              <w:rPr>
+                <w:sz w:val="19"/>
+              </w:rPr>
+            </w:r>
+            <w:r>
+              <w:rPr>
+                <w:sz w:val="19"/>
+              </w:rPr>
+              <w:t>NEAT1</w:t>
+            </w:r>
+          </w:p>
+        </w:tc>
+        <w:tc>
+          <w:tcPr>
+            <w:tcW w:type="dxa" w:w="1440"/>
+          </w:tcPr>
+          <w:p>
+            <w:r>
+              <w:rPr>
+                <w:sz w:val="19"/>
+              </w:rPr>
+            </w:r>
+            <w:r>
+              <w:rPr>
+                <w:sz w:val="19"/>
+              </w:rPr>
+              <w:t>−0.259</w:t>
+            </w:r>
+          </w:p>
+        </w:tc>
+        <w:tc>
+          <w:tcPr>
+            <w:tcW w:type="dxa" w:w="1440"/>
+          </w:tcPr>
+          <w:p>
+            <w:r>
+              <w:rPr>
+                <w:sz w:val="19"/>
+              </w:rPr>
+            </w:r>
+            <w:r>
+              <w:rPr>
+                <w:sz w:val="19"/>
+              </w:rPr>
+              <w:t>3.22×10⁻⁵</w:t>
+            </w:r>
+          </w:p>
+        </w:tc>
+        <w:tc>
+          <w:tcPr>
+            <w:tcW w:type="dxa" w:w="1440"/>
+          </w:tcPr>
+          <w:p>
+            <w:r>
+              <w:rPr>
+                <w:sz w:val="19"/>
+              </w:rPr>
+            </w:r>
+            <w:r>
+              <w:rPr>
+                <w:sz w:val="19"/>
+              </w:rPr>
+              <w:t>↑ CD14</w:t>
+            </w:r>
+          </w:p>
+        </w:tc>
+        <w:tc>
+          <w:tcPr>
+            <w:tcW w:type="dxa" w:w="1440"/>
+          </w:tcPr>
+          <w:p>
+            <w:r>
+              <w:rPr>
+                <w:sz w:val="19"/>
+              </w:rPr>
+            </w:r>
+            <w:r>
+              <w:rPr>
+                <w:sz w:val="19"/>
+              </w:rPr>
+              <w:t>+0.26</w:t>
+            </w:r>
+          </w:p>
+        </w:tc>
+        <w:tc>
+          <w:tcPr>
+            <w:tcW w:type="dxa" w:w="1440"/>
+          </w:tcPr>
+          <w:p>
+            <w:r>
+              <w:rPr>
+                <w:sz w:val="19"/>
+              </w:rPr>
+            </w:r>
+            <w:r>
+              <w:rPr>
+                <w:sz w:val="19"/>
+              </w:rPr>
+              <w:t>0.162</w:t>
+            </w:r>
+          </w:p>
+        </w:tc>
+      </w:tr>
+      <w:tr>
+        <w:tc>
+          <w:tcPr>
+            <w:tcW w:type="dxa" w:w="1440"/>
+          </w:tcPr>
+          <w:p>
+            <w:r>
+              <w:rPr>
+                <w:sz w:val="19"/>
+              </w:rPr>
+            </w:r>
+            <w:r>
+              <w:rPr>
+                <w:sz w:val="19"/>
+              </w:rPr>
+              <w:t>AC007952.4</w:t>
+            </w:r>
+          </w:p>
+        </w:tc>
+        <w:tc>
+          <w:tcPr>
+            <w:tcW w:type="dxa" w:w="1440"/>
+          </w:tcPr>
+          <w:p>
+            <w:r>
+              <w:rPr>
+                <w:sz w:val="19"/>
+              </w:rPr>
+            </w:r>
+            <w:r>
+              <w:rPr>
+                <w:sz w:val="19"/>
+              </w:rPr>
+              <w:t>−0.236</w:t>
+            </w:r>
+          </w:p>
+        </w:tc>
+        <w:tc>
+          <w:tcPr>
+            <w:tcW w:type="dxa" w:w="1440"/>
+          </w:tcPr>
+          <w:p>
+            <w:r>
+              <w:rPr>
+                <w:sz w:val="19"/>
+              </w:rPr>
+            </w:r>
+            <w:r>
+              <w:rPr>
+                <w:sz w:val="19"/>
+              </w:rPr>
+              <w:t>1.69×10⁻⁵</w:t>
+            </w:r>
+          </w:p>
+        </w:tc>
+        <w:tc>
+          <w:tcPr>
+            <w:tcW w:type="dxa" w:w="1440"/>
+          </w:tcPr>
+          <w:p>
+            <w:r>
+              <w:rPr>
+                <w:sz w:val="19"/>
+              </w:rPr>
+            </w:r>
+            <w:r>
+              <w:rPr>
+                <w:sz w:val="19"/>
+              </w:rPr>
+              <w:t>↑ CD14</w:t>
+            </w:r>
+          </w:p>
+        </w:tc>
+        <w:tc>
+          <w:tcPr>
+            <w:tcW w:type="dxa" w:w="1440"/>
+          </w:tcPr>
+          <w:p>
+            <w:r>
+              <w:rPr>
+                <w:sz w:val="19"/>
+              </w:rPr>
+            </w:r>
+            <w:r>
+              <w:rPr>
+                <w:sz w:val="19"/>
+              </w:rPr>
+              <w:t>—</w:t>
+            </w:r>
+          </w:p>
+        </w:tc>
+        <w:tc>
+          <w:tcPr>
+            <w:tcW w:type="dxa" w:w="1440"/>
+          </w:tcPr>
+          <w:p>
+            <w:r>
+              <w:rPr>
+                <w:sz w:val="19"/>
+              </w:rPr>
+            </w:r>
+            <w:r>
+              <w:rPr>
+                <w:sz w:val="19"/>
+              </w:rPr>
+              <w:t>—</w:t>
+            </w:r>
+          </w:p>
+        </w:tc>
+      </w:tr>
+      <w:tr>
+        <w:tc>
+          <w:tcPr>
+            <w:tcW w:type="dxa" w:w="1440"/>
+          </w:tcPr>
+          <w:p>
+            <w:r>
+              <w:rPr>
+                <w:sz w:val="19"/>
+              </w:rPr>
+            </w:r>
+            <w:r>
+              <w:rPr>
+                <w:sz w:val="19"/>
+              </w:rPr>
+              <w:t>LINC00861</w:t>
+            </w:r>
+          </w:p>
+        </w:tc>
+        <w:tc>
+          <w:tcPr>
+            <w:tcW w:type="dxa" w:w="1440"/>
+          </w:tcPr>
+          <w:p>
+            <w:r>
+              <w:rPr>
+                <w:sz w:val="19"/>
+              </w:rPr>
+            </w:r>
+            <w:r>
+              <w:rPr>
+                <w:sz w:val="19"/>
+              </w:rPr>
+              <w:t>+0.225</w:t>
+            </w:r>
+          </w:p>
+        </w:tc>
+        <w:tc>
+          <w:tcPr>
+            <w:tcW w:type="dxa" w:w="1440"/>
+          </w:tcPr>
+          <w:p>
+            <w:r>
+              <w:rPr>
+                <w:sz w:val="19"/>
+              </w:rPr>
+            </w:r>
+            <w:r>
+              <w:rPr>
+                <w:sz w:val="19"/>
+              </w:rPr>
+              <w:t>6.16×10⁻⁶</w:t>
+            </w:r>
+          </w:p>
+        </w:tc>
+        <w:tc>
+          <w:tcPr>
+            <w:tcW w:type="dxa" w:w="1440"/>
+          </w:tcPr>
+          <w:p>
+            <w:r>
+              <w:rPr>
+                <w:sz w:val="19"/>
+              </w:rPr>
+            </w:r>
+            <w:r>
+              <w:rPr>
+                <w:sz w:val="19"/>
+              </w:rPr>
+              <w:t>↑ CD16</w:t>
+            </w:r>
+          </w:p>
+        </w:tc>
+        <w:tc>
+          <w:tcPr>
+            <w:tcW w:type="dxa" w:w="1440"/>
+          </w:tcPr>
+          <w:p>
+            <w:r>
+              <w:rPr>
+                <w:sz w:val="19"/>
+              </w:rPr>
+            </w:r>
+            <w:r>
+              <w:rPr>
+                <w:sz w:val="19"/>
+              </w:rPr>
+              <w:t>+0.11</w:t>
+            </w:r>
+          </w:p>
+        </w:tc>
+        <w:tc>
+          <w:tcPr>
+            <w:tcW w:type="dxa" w:w="1440"/>
+          </w:tcPr>
+          <w:p>
+            <w:r>
+              <w:rPr>
+                <w:sz w:val="19"/>
+              </w:rPr>
+            </w:r>
+            <w:r>
+              <w:rPr>
+                <w:sz w:val="19"/>
+              </w:rPr>
+              <w:t>0.697</w:t>
+            </w:r>
+          </w:p>
+        </w:tc>
+      </w:tr>
+      <w:tr>
+        <w:tc>
+          <w:tcPr>
+            <w:tcW w:type="dxa" w:w="1440"/>
+          </w:tcPr>
+          <w:p>
+            <w:r>
+              <w:rPr>
+                <w:sz w:val="19"/>
+              </w:rPr>
+            </w:r>
+            <w:r>
+              <w:rPr>
+                <w:sz w:val="19"/>
+              </w:rPr>
+              <w:t>AC020651.2</w:t>
+            </w:r>
+          </w:p>
+        </w:tc>
+        <w:tc>
+          <w:tcPr>
+            <w:tcW w:type="dxa" w:w="1440"/>
+          </w:tcPr>
+          <w:p>
+            <w:r>
+              <w:rPr>
+                <w:sz w:val="19"/>
+              </w:rPr>
+            </w:r>
+            <w:r>
+              <w:rPr>
+                <w:sz w:val="19"/>
+              </w:rPr>
+              <w:t>+0.208</w:t>
+            </w:r>
+          </w:p>
+        </w:tc>
+        <w:tc>
+          <w:tcPr>
+            <w:tcW w:type="dxa" w:w="1440"/>
+          </w:tcPr>
+          <w:p>
+            <w:r>
+              <w:rPr>
+                <w:sz w:val="19"/>
+              </w:rPr>
+            </w:r>
+            <w:r>
+              <w:rPr>
+                <w:sz w:val="19"/>
+              </w:rPr>
+              <w:t>1.42×10⁻⁵</w:t>
+            </w:r>
+          </w:p>
+        </w:tc>
+        <w:tc>
+          <w:tcPr>
+            <w:tcW w:type="dxa" w:w="1440"/>
+          </w:tcPr>
+          <w:p>
+            <w:r>
+              <w:rPr>
+                <w:sz w:val="19"/>
+              </w:rPr>
+            </w:r>
+            <w:r>
+              <w:rPr>
+                <w:sz w:val="19"/>
+              </w:rPr>
+              <w:t>↑ CD16</w:t>
+            </w:r>
+          </w:p>
+        </w:tc>
+        <w:tc>
+          <w:tcPr>
+            <w:tcW w:type="dxa" w:w="1440"/>
+          </w:tcPr>
+          <w:p>
+            <w:r>
+              <w:rPr>
+                <w:sz w:val="19"/>
+              </w:rPr>
+            </w:r>
+            <w:r>
+              <w:rPr>
+                <w:sz w:val="19"/>
+              </w:rPr>
+              <w:t>−0.13</w:t>
+            </w:r>
+          </w:p>
+        </w:tc>
+        <w:tc>
+          <w:tcPr>
+            <w:tcW w:type="dxa" w:w="1440"/>
+          </w:tcPr>
+          <w:p>
+            <w:r>
+              <w:rPr>
+                <w:sz w:val="19"/>
+              </w:rPr>
+            </w:r>
+            <w:r>
+              <w:rPr>
+                <w:sz w:val="19"/>
+              </w:rPr>
+              <w:t>0.711</w:t>
+            </w:r>
+          </w:p>
+        </w:tc>
+      </w:tr>
+      <w:tr>
+        <w:tc>
+          <w:tcPr>
+            <w:tcW w:type="dxa" w:w="1440"/>
+          </w:tcPr>
+          <w:p>
+            <w:r>
+              <w:rPr>
+                <w:sz w:val="19"/>
+              </w:rPr>
+            </w:r>
+            <w:r>
+              <w:rPr>
+                <w:sz w:val="19"/>
+              </w:rPr>
+              <w:t>LINC00937</w:t>
+            </w:r>
+          </w:p>
+        </w:tc>
+        <w:tc>
+          <w:tcPr>
+            <w:tcW w:type="dxa" w:w="1440"/>
+          </w:tcPr>
+          <w:p>
+            <w:r>
+              <w:rPr>
+                <w:sz w:val="19"/>
+              </w:rPr>
+            </w:r>
+            <w:r>
+              <w:rPr>
+                <w:sz w:val="19"/>
+              </w:rPr>
+              <w:t>−0.206</w:t>
+            </w:r>
+          </w:p>
+        </w:tc>
+        <w:tc>
+          <w:tcPr>
+            <w:tcW w:type="dxa" w:w="1440"/>
+          </w:tcPr>
+          <w:p>
+            <w:r>
+              <w:rPr>
+                <w:sz w:val="19"/>
+              </w:rPr>
+            </w:r>
+            <w:r>
+              <w:rPr>
+                <w:sz w:val="19"/>
+              </w:rPr>
+              <w:t>1.23×10⁻⁵</w:t>
+            </w:r>
+          </w:p>
+        </w:tc>
+        <w:tc>
+          <w:tcPr>
+            <w:tcW w:type="dxa" w:w="1440"/>
+          </w:tcPr>
+          <w:p>
+            <w:r>
+              <w:rPr>
+                <w:sz w:val="19"/>
+              </w:rPr>
+            </w:r>
+            <w:r>
+              <w:rPr>
+                <w:sz w:val="19"/>
+              </w:rPr>
+              <w:t>↑ CD14</w:t>
+            </w:r>
+          </w:p>
+        </w:tc>
+        <w:tc>
+          <w:tcPr>
+            <w:tcW w:type="dxa" w:w="1440"/>
+          </w:tcPr>
+          <w:p>
+            <w:r>
+              <w:rPr>
+                <w:sz w:val="19"/>
+              </w:rPr>
+            </w:r>
+            <w:r>
+              <w:rPr>
+                <w:sz w:val="19"/>
+              </w:rPr>
+              <w:t>+0.29</w:t>
+            </w:r>
+          </w:p>
+        </w:tc>
+        <w:tc>
+          <w:tcPr>
+            <w:tcW w:type="dxa" w:w="1440"/>
+          </w:tcPr>
+          <w:p>
+            <w:r>
+              <w:rPr>
+                <w:sz w:val="19"/>
+              </w:rPr>
+            </w:r>
+            <w:r>
+              <w:rPr>
+                <w:sz w:val="19"/>
+              </w:rPr>
+              <w:t>0.333</w:t>
+            </w:r>
+          </w:p>
+        </w:tc>
+      </w:tr>
+      <w:tr>
+        <w:tc>
+          <w:tcPr>
+            <w:tcW w:type="dxa" w:w="1440"/>
+          </w:tcPr>
+          <w:p>
+            <w:r>
+              <w:rPr>
+                <w:sz w:val="19"/>
+              </w:rPr>
+            </w:r>
+            <w:r>
+              <w:rPr>
+                <w:sz w:val="19"/>
+              </w:rPr>
+              <w:t>LINC02432</w:t>
+            </w:r>
+          </w:p>
+        </w:tc>
+        <w:tc>
+          <w:tcPr>
+            <w:tcW w:type="dxa" w:w="1440"/>
+          </w:tcPr>
+          <w:p>
+            <w:r>
+              <w:rPr>
+                <w:sz w:val="19"/>
+              </w:rPr>
+            </w:r>
+            <w:r>
+              <w:rPr>
+                <w:sz w:val="19"/>
+              </w:rPr>
+              <w:t>+0.204</w:t>
+            </w:r>
+          </w:p>
+        </w:tc>
+        <w:tc>
+          <w:tcPr>
+            <w:tcW w:type="dxa" w:w="1440"/>
+          </w:tcPr>
+          <w:p>
+            <w:r>
+              <w:rPr>
+                <w:sz w:val="19"/>
+              </w:rPr>
+            </w:r>
+            <w:r>
+              <w:rPr>
+                <w:sz w:val="19"/>
+              </w:rPr>
+              <w:t>4.15×10⁻⁵</w:t>
+            </w:r>
+          </w:p>
+        </w:tc>
+        <w:tc>
+          <w:tcPr>
+            <w:tcW w:type="dxa" w:w="1440"/>
+          </w:tcPr>
+          <w:p>
+            <w:r>
+              <w:rPr>
+                <w:sz w:val="19"/>
+              </w:rPr>
+            </w:r>
+            <w:r>
+              <w:rPr>
+                <w:sz w:val="19"/>
+              </w:rPr>
+              <w:t>↑ CD16</w:t>
+            </w:r>
+          </w:p>
+        </w:tc>
+        <w:tc>
+          <w:tcPr>
+            <w:tcW w:type="dxa" w:w="1440"/>
+          </w:tcPr>
+          <w:p>
+            <w:r>
+              <w:rPr>
+                <w:sz w:val="19"/>
+              </w:rPr>
+            </w:r>
+            <w:r>
+              <w:rPr>
+                <w:sz w:val="19"/>
+              </w:rPr>
+              <w:t>+0.35</w:t>
+            </w:r>
+          </w:p>
+        </w:tc>
+        <w:tc>
+          <w:tcPr>
+            <w:tcW w:type="dxa" w:w="1440"/>
+          </w:tcPr>
+          <w:p>
+            <w:r>
+              <w:rPr>
+                <w:sz w:val="19"/>
+              </w:rPr>
+            </w:r>
+            <w:r>
+              <w:rPr>
+                <w:sz w:val="19"/>
+              </w:rPr>
+              <w:t>0.483</w:t>
+            </w:r>
+          </w:p>
+        </w:tc>
+      </w:tr>
+      <w:tr>
+        <w:tc>
+          <w:tcPr>
+            <w:tcW w:type="dxa" w:w="1440"/>
+          </w:tcPr>
+          <w:p>
+            <w:r>
+              <w:rPr>
+                <w:sz w:val="19"/>
+              </w:rPr>
+            </w:r>
+            <w:r>
+              <w:rPr>
+                <w:sz w:val="19"/>
+              </w:rPr>
+              <w:t>AL133415.1</w:t>
+            </w:r>
+          </w:p>
+        </w:tc>
+        <w:tc>
+          <w:tcPr>
+            <w:tcW w:type="dxa" w:w="1440"/>
+          </w:tcPr>
+          <w:p>
+            <w:r>
+              <w:rPr>
+                <w:sz w:val="19"/>
+              </w:rPr>
+            </w:r>
+            <w:r>
+              <w:rPr>
+                <w:sz w:val="19"/>
+              </w:rPr>
+              <w:t>−0.199</w:t>
+            </w:r>
+          </w:p>
+        </w:tc>
+        <w:tc>
+          <w:tcPr>
+            <w:tcW w:type="dxa" w:w="1440"/>
+          </w:tcPr>
+          <w:p>
+            <w:r>
+              <w:rPr>
+                <w:sz w:val="19"/>
+              </w:rPr>
+            </w:r>
+            <w:r>
+              <w:rPr>
+                <w:sz w:val="19"/>
+              </w:rPr>
+              <w:t>2.26×10⁻⁵</w:t>
+            </w:r>
+          </w:p>
+        </w:tc>
+        <w:tc>
+          <w:tcPr>
+            <w:tcW w:type="dxa" w:w="1440"/>
+          </w:tcPr>
+          <w:p>
+            <w:r>
+              <w:rPr>
+                <w:sz w:val="19"/>
+              </w:rPr>
+            </w:r>
+            <w:r>
+              <w:rPr>
+                <w:sz w:val="19"/>
+              </w:rPr>
+              <w:t>↑ CD14</w:t>
+            </w:r>
+          </w:p>
+        </w:tc>
+        <w:tc>
+          <w:tcPr>
+            <w:tcW w:type="dxa" w:w="1440"/>
+          </w:tcPr>
+          <w:p>
+            <w:r>
+              <w:rPr>
+                <w:sz w:val="19"/>
+              </w:rPr>
+            </w:r>
+            <w:r>
+              <w:rPr>
+                <w:sz w:val="19"/>
+              </w:rPr>
+              <w:t>+0.37</w:t>
+            </w:r>
+          </w:p>
+        </w:tc>
+        <w:tc>
+          <w:tcPr>
+            <w:tcW w:type="dxa" w:w="1440"/>
+          </w:tcPr>
+          <w:p>
+            <w:r>
+              <w:rPr>
+                <w:sz w:val="19"/>
+              </w:rPr>
+            </w:r>
+            <w:r>
+              <w:rPr>
+                <w:sz w:val="19"/>
+              </w:rPr>
+              <w:t>0.333</w:t>
+            </w:r>
+          </w:p>
+        </w:tc>
+      </w:tr>
+      <w:tr>
+        <w:tc>
+          <w:tcPr>
+            <w:tcW w:type="dxa" w:w="1440"/>
+          </w:tcPr>
+          <w:p>
+            <w:r>
+              <w:rPr>
+                <w:sz w:val="19"/>
+              </w:rPr>
+            </w:r>
+            <w:r>
+              <w:rPr>
+                <w:sz w:val="19"/>
+              </w:rPr>
+              <w:t>AC064805.1</w:t>
+            </w:r>
+          </w:p>
+        </w:tc>
+        <w:tc>
+          <w:tcPr>
+            <w:tcW w:type="dxa" w:w="1440"/>
+          </w:tcPr>
+          <w:p>
+            <w:r>
+              <w:rPr>
+                <w:sz w:val="19"/>
+              </w:rPr>
+            </w:r>
+            <w:r>
+              <w:rPr>
+                <w:sz w:val="19"/>
+              </w:rPr>
+              <w:t>+0.197</w:t>
+            </w:r>
+          </w:p>
+        </w:tc>
+        <w:tc>
+          <w:tcPr>
+            <w:tcW w:type="dxa" w:w="1440"/>
+          </w:tcPr>
+          <w:p>
+            <w:r>
+              <w:rPr>
+                <w:sz w:val="19"/>
+              </w:rPr>
+            </w:r>
+            <w:r>
+              <w:rPr>
+                <w:sz w:val="19"/>
+              </w:rPr>
+              <w:t>2.08×10⁻⁵</w:t>
+            </w:r>
+          </w:p>
+        </w:tc>
+        <w:tc>
+          <w:tcPr>
+            <w:tcW w:type="dxa" w:w="1440"/>
+          </w:tcPr>
+          <w:p>
+            <w:r>
+              <w:rPr>
+                <w:sz w:val="19"/>
+              </w:rPr>
+            </w:r>
+            <w:r>
+              <w:rPr>
+                <w:sz w:val="19"/>
+              </w:rPr>
+              <w:t>↑ CD16</w:t>
+            </w:r>
+          </w:p>
+        </w:tc>
+        <w:tc>
+          <w:tcPr>
+            <w:tcW w:type="dxa" w:w="1440"/>
+          </w:tcPr>
+          <w:p>
+            <w:r>
+              <w:rPr>
+                <w:sz w:val="19"/>
+              </w:rPr>
+            </w:r>
+            <w:r>
+              <w:rPr>
+                <w:sz w:val="19"/>
+              </w:rPr>
+              <w:t>+0.17</w:t>
+            </w:r>
+          </w:p>
+        </w:tc>
+        <w:tc>
+          <w:tcPr>
+            <w:tcW w:type="dxa" w:w="1440"/>
+          </w:tcPr>
+          <w:p>
+            <w:r>
+              <w:rPr>
+                <w:sz w:val="19"/>
+              </w:rPr>
+            </w:r>
+            <w:r>
+              <w:rPr>
+                <w:sz w:val="19"/>
+              </w:rPr>
+              <w:t>0.697</w:t>
+            </w:r>
+          </w:p>
+        </w:tc>
+      </w:tr>
+      <w:tr>
+        <w:tc>
+          <w:tcPr>
+            <w:tcW w:type="dxa" w:w="1440"/>
+          </w:tcPr>
+          <w:p>
+            <w:r>
+              <w:rPr>
+                <w:sz w:val="19"/>
+              </w:rPr>
+            </w:r>
+            <w:r>
+              <w:rPr>
+                <w:sz w:val="19"/>
+              </w:rPr>
+              <w:t>AL139246.5</w:t>
+            </w:r>
+          </w:p>
+        </w:tc>
+        <w:tc>
+          <w:tcPr>
+            <w:tcW w:type="dxa" w:w="1440"/>
+          </w:tcPr>
+          <w:p>
+            <w:r>
+              <w:rPr>
+                <w:sz w:val="19"/>
+              </w:rPr>
+            </w:r>
+            <w:r>
+              <w:rPr>
+                <w:sz w:val="19"/>
+              </w:rPr>
+              <w:t>+0.193</w:t>
+            </w:r>
+          </w:p>
+        </w:tc>
+        <w:tc>
+          <w:tcPr>
+            <w:tcW w:type="dxa" w:w="1440"/>
+          </w:tcPr>
+          <w:p>
+            <w:r>
+              <w:rPr>
+                <w:sz w:val="19"/>
+              </w:rPr>
+            </w:r>
+            <w:r>
+              <w:rPr>
+                <w:sz w:val="19"/>
+              </w:rPr>
+              <w:t>3.29×10⁻⁶</w:t>
+            </w:r>
+          </w:p>
+        </w:tc>
+        <w:tc>
+          <w:tcPr>
+            <w:tcW w:type="dxa" w:w="1440"/>
+          </w:tcPr>
+          <w:p>
+            <w:r>
+              <w:rPr>
+                <w:sz w:val="19"/>
+              </w:rPr>
+            </w:r>
+            <w:r>
+              <w:rPr>
+                <w:sz w:val="19"/>
+              </w:rPr>
+              <w:t>↑ CD16</w:t>
+            </w:r>
+          </w:p>
+        </w:tc>
+        <w:tc>
+          <w:tcPr>
+            <w:tcW w:type="dxa" w:w="1440"/>
+          </w:tcPr>
+          <w:p>
+            <w:r>
+              <w:rPr>
+                <w:sz w:val="19"/>
+              </w:rPr>
+            </w:r>
+            <w:r>
+              <w:rPr>
+                <w:sz w:val="19"/>
+              </w:rPr>
+              <w:t>−0.10</w:t>
+            </w:r>
+          </w:p>
+        </w:tc>
+        <w:tc>
+          <w:tcPr>
+            <w:tcW w:type="dxa" w:w="1440"/>
+          </w:tcPr>
+          <w:p>
+            <w:r>
+              <w:rPr>
+                <w:sz w:val="19"/>
+              </w:rPr>
+            </w:r>
+            <w:r>
+              <w:rPr>
+                <w:sz w:val="19"/>
+              </w:rPr>
+              <w:t>0.714</w:t>
+            </w:r>
+          </w:p>
+        </w:tc>
+      </w:tr>
+      <w:tr>
+        <w:tc>
+          <w:tcPr>
+            <w:tcW w:type="dxa" w:w="1440"/>
+          </w:tcPr>
+          <w:p>
+            <w:r>
+              <w:rPr>
+                <w:sz w:val="19"/>
+              </w:rPr>
+            </w:r>
+            <w:r>
+              <w:rPr>
+                <w:sz w:val="19"/>
+              </w:rPr>
+              <w:t>SNHG1</w:t>
+            </w:r>
+          </w:p>
+        </w:tc>
+        <w:tc>
+          <w:tcPr>
+            <w:tcW w:type="dxa" w:w="1440"/>
+          </w:tcPr>
+          <w:p>
+            <w:r>
+              <w:rPr>
+                <w:sz w:val="19"/>
+              </w:rPr>
+            </w:r>
+            <w:r>
+              <w:rPr>
+                <w:sz w:val="19"/>
+              </w:rPr>
+              <w:t>+0.189</w:t>
+            </w:r>
+          </w:p>
+        </w:tc>
+        <w:tc>
+          <w:tcPr>
+            <w:tcW w:type="dxa" w:w="1440"/>
+          </w:tcPr>
+          <w:p>
+            <w:r>
+              <w:rPr>
+                <w:sz w:val="19"/>
+              </w:rPr>
+            </w:r>
+            <w:r>
+              <w:rPr>
+                <w:sz w:val="19"/>
+              </w:rPr>
+              <w:t>6.16×10⁻⁶</w:t>
+            </w:r>
+          </w:p>
+        </w:tc>
+        <w:tc>
+          <w:tcPr>
+            <w:tcW w:type="dxa" w:w="1440"/>
+          </w:tcPr>
+          <w:p>
+            <w:r>
+              <w:rPr>
+                <w:sz w:val="19"/>
+              </w:rPr>
+            </w:r>
+            <w:r>
+              <w:rPr>
+                <w:sz w:val="19"/>
+              </w:rPr>
+              <w:t>↑ CD16</w:t>
+            </w:r>
+          </w:p>
+        </w:tc>
+        <w:tc>
+          <w:tcPr>
+            <w:tcW w:type="dxa" w:w="1440"/>
+          </w:tcPr>
+          <w:p>
+            <w:r>
+              <w:rPr>
+                <w:sz w:val="19"/>
+              </w:rPr>
+            </w:r>
+            <w:r>
+              <w:rPr>
+                <w:sz w:val="19"/>
+              </w:rPr>
+              <w:t>−0.05</w:t>
+            </w:r>
+          </w:p>
+        </w:tc>
+        <w:tc>
+          <w:tcPr>
+            <w:tcW w:type="dxa" w:w="1440"/>
+          </w:tcPr>
+          <w:p>
+            <w:r>
+              <w:rPr>
+                <w:sz w:val="19"/>
+              </w:rPr>
+            </w:r>
+            <w:r>
+              <w:rPr>
+                <w:sz w:val="19"/>
+              </w:rPr>
+              <w:t>0.714</w:t>
+            </w:r>
+          </w:p>
+        </w:tc>
+      </w:tr>
+      <w:tr>
+        <w:tc>
+          <w:tcPr>
+            <w:tcW w:type="dxa" w:w="1440"/>
+          </w:tcPr>
+          <w:p>
+            <w:r>
+              <w:rPr>
+                <w:sz w:val="19"/>
+              </w:rPr>
+            </w:r>
+            <w:r>
+              <w:rPr>
+                <w:sz w:val="19"/>
+              </w:rPr>
+              <w:t>LINC02345</w:t>
+            </w:r>
+          </w:p>
+        </w:tc>
+        <w:tc>
+          <w:tcPr>
+            <w:tcW w:type="dxa" w:w="1440"/>
+          </w:tcPr>
+          <w:p>
+            <w:r>
+              <w:rPr>
+                <w:sz w:val="19"/>
+              </w:rPr>
+            </w:r>
+            <w:r>
+              <w:rPr>
+                <w:sz w:val="19"/>
+              </w:rPr>
+              <w:t>+0.185</w:t>
+            </w:r>
+          </w:p>
+        </w:tc>
+        <w:tc>
+          <w:tcPr>
+            <w:tcW w:type="dxa" w:w="1440"/>
+          </w:tcPr>
+          <w:p>
+            <w:r>
+              <w:rPr>
+                <w:sz w:val="19"/>
+              </w:rPr>
+            </w:r>
+            <w:r>
+              <w:rPr>
+                <w:sz w:val="19"/>
+              </w:rPr>
+              <w:t>5.36×10⁻⁵</w:t>
+            </w:r>
+          </w:p>
+        </w:tc>
+        <w:tc>
+          <w:tcPr>
+            <w:tcW w:type="dxa" w:w="1440"/>
+          </w:tcPr>
+          <w:p>
+            <w:r>
+              <w:rPr>
+                <w:sz w:val="19"/>
+              </w:rPr>
+            </w:r>
+            <w:r>
+              <w:rPr>
+                <w:sz w:val="19"/>
+              </w:rPr>
+              <w:t>↑ CD16</w:t>
+            </w:r>
+          </w:p>
+        </w:tc>
+        <w:tc>
+          <w:tcPr>
+            <w:tcW w:type="dxa" w:w="1440"/>
+          </w:tcPr>
+          <w:p>
+            <w:r>
+              <w:rPr>
+                <w:sz w:val="19"/>
+              </w:rPr>
+            </w:r>
+            <w:r>
+              <w:rPr>
+                <w:sz w:val="19"/>
+              </w:rPr>
+              <w:t>+0.18</w:t>
+            </w:r>
+          </w:p>
+        </w:tc>
+        <w:tc>
+          <w:tcPr>
+            <w:tcW w:type="dxa" w:w="1440"/>
+          </w:tcPr>
+          <w:p>
+            <w:r>
+              <w:rPr>
+                <w:sz w:val="19"/>
+              </w:rPr>
+            </w:r>
+            <w:r>
+              <w:rPr>
+                <w:sz w:val="19"/>
+              </w:rPr>
+              <w:t>0.697</w:t>
+            </w:r>
+          </w:p>
+        </w:tc>
+      </w:tr>
+      <w:tr>
+        <w:tc>
+          <w:tcPr>
+            <w:tcW w:type="dxa" w:w="1440"/>
+          </w:tcPr>
+          <w:p>
+            <w:r>
+              <w:rPr>
+                <w:sz w:val="19"/>
+              </w:rPr>
+            </w:r>
+            <w:r>
+              <w:rPr>
+                <w:sz w:val="19"/>
+              </w:rPr>
+              <w:t>LINC02384</w:t>
+            </w:r>
+          </w:p>
+        </w:tc>
+        <w:tc>
+          <w:tcPr>
+            <w:tcW w:type="dxa" w:w="1440"/>
+          </w:tcPr>
+          <w:p>
+            <w:r>
+              <w:rPr>
+                <w:sz w:val="19"/>
+              </w:rPr>
+            </w:r>
+            <w:r>
+              <w:rPr>
+                <w:sz w:val="19"/>
+              </w:rPr>
+              <w:t>+0.183</w:t>
+            </w:r>
+          </w:p>
+        </w:tc>
+        <w:tc>
+          <w:tcPr>
+            <w:tcW w:type="dxa" w:w="1440"/>
+          </w:tcPr>
+          <w:p>
+            <w:r>
+              <w:rPr>
+                <w:sz w:val="19"/>
+              </w:rPr>
+            </w:r>
+            <w:r>
+              <w:rPr>
+                <w:sz w:val="19"/>
+              </w:rPr>
+              <w:t>1.42×10⁻⁵</w:t>
+            </w:r>
+          </w:p>
+        </w:tc>
+        <w:tc>
+          <w:tcPr>
+            <w:tcW w:type="dxa" w:w="1440"/>
+          </w:tcPr>
+          <w:p>
+            <w:r>
+              <w:rPr>
+                <w:sz w:val="19"/>
+              </w:rPr>
+            </w:r>
+            <w:r>
+              <w:rPr>
+                <w:sz w:val="19"/>
+              </w:rPr>
+              <w:t>↑ CD16</w:t>
+            </w:r>
+          </w:p>
+        </w:tc>
+        <w:tc>
+          <w:tcPr>
+            <w:tcW w:type="dxa" w:w="1440"/>
+          </w:tcPr>
+          <w:p>
+            <w:r>
+              <w:rPr>
+                <w:sz w:val="19"/>
+              </w:rPr>
+            </w:r>
+            <w:r>
+              <w:rPr>
+                <w:sz w:val="19"/>
+              </w:rPr>
+              <w:t>+0.12</w:t>
+            </w:r>
+          </w:p>
+        </w:tc>
+        <w:tc>
+          <w:tcPr>
+            <w:tcW w:type="dxa" w:w="1440"/>
+          </w:tcPr>
+          <w:p>
+            <w:r>
+              <w:rPr>
+                <w:sz w:val="19"/>
+              </w:rPr>
+            </w:r>
+            <w:r>
+              <w:rPr>
+                <w:sz w:val="19"/>
+              </w:rPr>
+              <w:t>0.711</w:t>
+            </w:r>
+          </w:p>
+        </w:tc>
+      </w:tr>
+      <w:tr>
+        <w:tc>
+          <w:tcPr>
+            <w:tcW w:type="dxa" w:w="1440"/>
+          </w:tcPr>
+          <w:p>
+            <w:r>
+              <w:rPr>
+                <w:sz w:val="19"/>
+              </w:rPr>
+            </w:r>
+            <w:r>
+              <w:rPr>
+                <w:sz w:val="19"/>
+              </w:rPr>
+              <w:t>AC253572.2</w:t>
+            </w:r>
+          </w:p>
+        </w:tc>
+        <w:tc>
+          <w:tcPr>
+            <w:tcW w:type="dxa" w:w="1440"/>
+          </w:tcPr>
+          <w:p>
+            <w:r>
+              <w:rPr>
+                <w:sz w:val="19"/>
+              </w:rPr>
+            </w:r>
+            <w:r>
+              <w:rPr>
+                <w:sz w:val="19"/>
+              </w:rPr>
+              <w:t>−0.167</w:t>
+            </w:r>
+          </w:p>
+        </w:tc>
+        <w:tc>
+          <w:tcPr>
+            <w:tcW w:type="dxa" w:w="1440"/>
+          </w:tcPr>
+          <w:p>
+            <w:r>
+              <w:rPr>
+                <w:sz w:val="19"/>
+              </w:rPr>
+            </w:r>
+            <w:r>
+              <w:rPr>
+                <w:sz w:val="19"/>
+              </w:rPr>
+              <w:t>6.16×10⁻⁶</w:t>
+            </w:r>
+          </w:p>
+        </w:tc>
+        <w:tc>
+          <w:tcPr>
+            <w:tcW w:type="dxa" w:w="1440"/>
+          </w:tcPr>
+          <w:p>
+            <w:r>
+              <w:rPr>
+                <w:sz w:val="19"/>
+              </w:rPr>
+            </w:r>
+            <w:r>
+              <w:rPr>
+                <w:sz w:val="19"/>
+              </w:rPr>
+              <w:t>↑ CD14</w:t>
+            </w:r>
+          </w:p>
+        </w:tc>
+        <w:tc>
+          <w:tcPr>
+            <w:tcW w:type="dxa" w:w="1440"/>
+          </w:tcPr>
+          <w:p>
+            <w:r>
+              <w:rPr>
+                <w:sz w:val="19"/>
+              </w:rPr>
+            </w:r>
+            <w:r>
+              <w:rPr>
+                <w:sz w:val="19"/>
+              </w:rPr>
+              <w:t>—</w:t>
+            </w:r>
+          </w:p>
+        </w:tc>
+        <w:tc>
+          <w:tcPr>
+            <w:tcW w:type="dxa" w:w="1440"/>
+          </w:tcPr>
+          <w:p>
+            <w:r>
+              <w:rPr>
+                <w:sz w:val="19"/>
+              </w:rPr>
+            </w:r>
+            <w:r>
+              <w:rPr>
+                <w:sz w:val="19"/>
+              </w:rPr>
+              <w:t>—</w:t>
+            </w:r>
+          </w:p>
+        </w:tc>
+      </w:tr>
+      <w:tr>
+        <w:tc>
+          <w:tcPr>
+            <w:tcW w:type="dxa" w:w="1440"/>
+          </w:tcPr>
+          <w:p>
+            <w:r>
+              <w:rPr>
+                <w:sz w:val="19"/>
+              </w:rPr>
+            </w:r>
+            <w:r>
+              <w:rPr>
+                <w:sz w:val="19"/>
+              </w:rPr>
+              <w:t>SNHG8</w:t>
+            </w:r>
+          </w:p>
+        </w:tc>
+        <w:tc>
+          <w:tcPr>
+            <w:tcW w:type="dxa" w:w="1440"/>
+          </w:tcPr>
+          <w:p>
+            <w:r>
+              <w:rPr>
+                <w:sz w:val="19"/>
+              </w:rPr>
+            </w:r>
+            <w:r>
+              <w:rPr>
+                <w:sz w:val="19"/>
+              </w:rPr>
+              <w:t>+0.165</w:t>
+            </w:r>
+          </w:p>
+        </w:tc>
+        <w:tc>
+          <w:tcPr>
+            <w:tcW w:type="dxa" w:w="1440"/>
+          </w:tcPr>
+          <w:p>
+            <w:r>
+              <w:rPr>
+                <w:sz w:val="19"/>
+              </w:rPr>
+            </w:r>
+            <w:r>
+              <w:rPr>
+                <w:sz w:val="19"/>
+              </w:rPr>
+              <w:t>1.36×10⁻⁶</w:t>
+            </w:r>
+          </w:p>
+        </w:tc>
+        <w:tc>
+          <w:tcPr>
+            <w:tcW w:type="dxa" w:w="1440"/>
+          </w:tcPr>
+          <w:p>
+            <w:r>
+              <w:rPr>
+                <w:sz w:val="19"/>
+              </w:rPr>
+            </w:r>
+            <w:r>
+              <w:rPr>
+                <w:sz w:val="19"/>
+              </w:rPr>
+              <w:t>↑ CD16</w:t>
+            </w:r>
+          </w:p>
+        </w:tc>
+        <w:tc>
+          <w:tcPr>
+            <w:tcW w:type="dxa" w:w="1440"/>
+          </w:tcPr>
+          <w:p>
+            <w:r>
+              <w:rPr>
+                <w:sz w:val="19"/>
+              </w:rPr>
+            </w:r>
+            <w:r>
+              <w:rPr>
+                <w:sz w:val="19"/>
+              </w:rPr>
+              <w:t>−0.17</w:t>
+            </w:r>
+          </w:p>
+        </w:tc>
+        <w:tc>
+          <w:tcPr>
+            <w:tcW w:type="dxa" w:w="1440"/>
+          </w:tcPr>
+          <w:p>
+            <w:r>
+              <w:rPr>
+                <w:sz w:val="19"/>
+              </w:rPr>
+            </w:r>
+            <w:r>
+              <w:rPr>
+                <w:sz w:val="19"/>
+              </w:rPr>
+              <w:t>0.570</w:t>
+            </w:r>
+          </w:p>
+        </w:tc>
+      </w:tr>
+      <w:tr>
+        <w:tc>
+          <w:tcPr>
+            <w:tcW w:type="dxa" w:w="1440"/>
+          </w:tcPr>
+          <w:p>
+            <w:r>
+              <w:rPr>
+                <w:sz w:val="19"/>
+              </w:rPr>
+            </w:r>
+            <w:r>
+              <w:rPr>
+                <w:sz w:val="19"/>
+              </w:rPr>
+              <w:t>LINC02773</w:t>
+            </w:r>
+          </w:p>
+        </w:tc>
+        <w:tc>
+          <w:tcPr>
+            <w:tcW w:type="dxa" w:w="1440"/>
+          </w:tcPr>
+          <w:p>
+            <w:r>
+              <w:rPr>
+                <w:sz w:val="19"/>
+              </w:rPr>
+            </w:r>
+            <w:r>
+              <w:rPr>
+                <w:sz w:val="19"/>
+              </w:rPr>
+              <w:t>+0.164</w:t>
+            </w:r>
+          </w:p>
+        </w:tc>
+        <w:tc>
+          <w:tcPr>
+            <w:tcW w:type="dxa" w:w="1440"/>
+          </w:tcPr>
+          <w:p>
+            <w:r>
+              <w:rPr>
+                <w:sz w:val="19"/>
+              </w:rPr>
+            </w:r>
+            <w:r>
+              <w:rPr>
+                <w:sz w:val="19"/>
+              </w:rPr>
+              <w:t>1.42×10⁻⁵</w:t>
+            </w:r>
+          </w:p>
+        </w:tc>
+        <w:tc>
+          <w:tcPr>
+            <w:tcW w:type="dxa" w:w="1440"/>
+          </w:tcPr>
+          <w:p>
+            <w:r>
+              <w:rPr>
+                <w:sz w:val="19"/>
+              </w:rPr>
+            </w:r>
+            <w:r>
+              <w:rPr>
+                <w:sz w:val="19"/>
+              </w:rPr>
+              <w:t>↑ CD16</w:t>
+            </w:r>
+          </w:p>
+        </w:tc>
+        <w:tc>
+          <w:tcPr>
+            <w:tcW w:type="dxa" w:w="1440"/>
+          </w:tcPr>
+          <w:p>
+            <w:r>
+              <w:rPr>
+                <w:sz w:val="19"/>
+              </w:rPr>
+            </w:r>
+            <w:r>
+              <w:rPr>
+                <w:sz w:val="19"/>
+              </w:rPr>
+              <w:t>+0.18</w:t>
+            </w:r>
+          </w:p>
+        </w:tc>
+        <w:tc>
+          <w:tcPr>
+            <w:tcW w:type="dxa" w:w="1440"/>
+          </w:tcPr>
+          <w:p>
+            <w:r>
+              <w:rPr>
+                <w:sz w:val="19"/>
+              </w:rPr>
+            </w:r>
+            <w:r>
+              <w:rPr>
+                <w:sz w:val="19"/>
+              </w:rPr>
+              <w:t>0.697</w:t>
+            </w:r>
+          </w:p>
+        </w:tc>
+      </w:tr>
+      <w:tr>
+        <w:tc>
+          <w:tcPr>
+            <w:tcW w:type="dxa" w:w="1440"/>
+          </w:tcPr>
+          <w:p>
+            <w:r>
+              <w:rPr>
+                <w:sz w:val="19"/>
+              </w:rPr>
+            </w:r>
+            <w:r>
+              <w:rPr>
+                <w:sz w:val="19"/>
+              </w:rPr>
+              <w:t>LINC01578</w:t>
+            </w:r>
+          </w:p>
+        </w:tc>
+        <w:tc>
+          <w:tcPr>
+            <w:tcW w:type="dxa" w:w="1440"/>
+          </w:tcPr>
+          <w:p>
+            <w:r>
+              <w:rPr>
+                <w:sz w:val="19"/>
+              </w:rPr>
+            </w:r>
+            <w:r>
+              <w:rPr>
+                <w:sz w:val="19"/>
+              </w:rPr>
+              <w:t>+0.159</w:t>
+            </w:r>
+          </w:p>
+        </w:tc>
+        <w:tc>
+          <w:tcPr>
+            <w:tcW w:type="dxa" w:w="1440"/>
+          </w:tcPr>
+          <w:p>
+            <w:r>
+              <w:rPr>
+                <w:sz w:val="19"/>
+              </w:rPr>
+            </w:r>
+            <w:r>
+              <w:rPr>
+                <w:sz w:val="19"/>
+              </w:rPr>
+              <w:t>1.14×10⁻⁴</w:t>
+            </w:r>
+          </w:p>
+        </w:tc>
+        <w:tc>
+          <w:tcPr>
+            <w:tcW w:type="dxa" w:w="1440"/>
+          </w:tcPr>
+          <w:p>
+            <w:r>
+              <w:rPr>
+                <w:sz w:val="19"/>
+              </w:rPr>
+            </w:r>
+            <w:r>
+              <w:rPr>
+                <w:sz w:val="19"/>
+              </w:rPr>
+              <w:t>↑ CD16</w:t>
+            </w:r>
+          </w:p>
+        </w:tc>
+        <w:tc>
+          <w:tcPr>
+            <w:tcW w:type="dxa" w:w="1440"/>
+          </w:tcPr>
+          <w:p>
+            <w:r>
+              <w:rPr>
+                <w:sz w:val="19"/>
+              </w:rPr>
+            </w:r>
+            <w:r>
+              <w:rPr>
+                <w:sz w:val="19"/>
+              </w:rPr>
+              <w:t>—</w:t>
+            </w:r>
+          </w:p>
+        </w:tc>
+        <w:tc>
+          <w:tcPr>
+            <w:tcW w:type="dxa" w:w="1440"/>
+          </w:tcPr>
+          <w:p>
+            <w:r>
+              <w:rPr>
+                <w:sz w:val="19"/>
+              </w:rPr>
+            </w:r>
+            <w:r>
+              <w:rPr>
+                <w:sz w:val="19"/>
+              </w:rPr>
+              <w:t>—</w:t>
+            </w:r>
+          </w:p>
+        </w:tc>
+      </w:tr>
+      <w:tr>
+        <w:tc>
+          <w:tcPr>
+            <w:tcW w:type="dxa" w:w="1440"/>
+          </w:tcPr>
+          <w:p>
+            <w:r>
+              <w:rPr>
+                <w:sz w:val="19"/>
+              </w:rPr>
+            </w:r>
+            <w:r>
+              <w:rPr>
+                <w:sz w:val="19"/>
+              </w:rPr>
+              <w:t>AC243960.1</w:t>
+            </w:r>
+          </w:p>
+        </w:tc>
+        <w:tc>
+          <w:tcPr>
+            <w:tcW w:type="dxa" w:w="1440"/>
+          </w:tcPr>
+          <w:p>
+            <w:r>
+              <w:rPr>
+                <w:sz w:val="19"/>
+              </w:rPr>
+            </w:r>
+            <w:r>
+              <w:rPr>
+                <w:sz w:val="19"/>
+              </w:rPr>
+              <w:t>+0.156</w:t>
+            </w:r>
+          </w:p>
+        </w:tc>
+        <w:tc>
+          <w:tcPr>
+            <w:tcW w:type="dxa" w:w="1440"/>
+          </w:tcPr>
+          <w:p>
+            <w:r>
+              <w:rPr>
+                <w:sz w:val="19"/>
+              </w:rPr>
+            </w:r>
+            <w:r>
+              <w:rPr>
+                <w:sz w:val="19"/>
+              </w:rPr>
+              <w:t>6.16×10⁻⁶</w:t>
+            </w:r>
+          </w:p>
+        </w:tc>
+        <w:tc>
+          <w:tcPr>
+            <w:tcW w:type="dxa" w:w="1440"/>
+          </w:tcPr>
+          <w:p>
+            <w:r>
+              <w:rPr>
+                <w:sz w:val="19"/>
+              </w:rPr>
+            </w:r>
+            <w:r>
+              <w:rPr>
+                <w:sz w:val="19"/>
+              </w:rPr>
+              <w:t>↑ CD16</w:t>
+            </w:r>
+          </w:p>
+        </w:tc>
+        <w:tc>
+          <w:tcPr>
+            <w:tcW w:type="dxa" w:w="1440"/>
+          </w:tcPr>
+          <w:p>
+            <w:r>
+              <w:rPr>
+                <w:sz w:val="19"/>
+              </w:rPr>
+            </w:r>
+            <w:r>
+              <w:rPr>
+                <w:sz w:val="19"/>
+              </w:rPr>
+              <w:t>−0.02</w:t>
+            </w:r>
+          </w:p>
+        </w:tc>
+        <w:tc>
+          <w:tcPr>
+            <w:tcW w:type="dxa" w:w="1440"/>
+          </w:tcPr>
+          <w:p>
+            <w:r>
+              <w:rPr>
+                <w:sz w:val="19"/>
+              </w:rPr>
+            </w:r>
+            <w:r>
+              <w:rPr>
+                <w:sz w:val="19"/>
+              </w:rPr>
+              <w:t>0.899</w:t>
+            </w:r>
+          </w:p>
+        </w:tc>
+      </w:tr>
+    </w:tbl>
+    <w:p/>
+    <w:p>
+      <w:r>
+        <w:t>Full 28-locus unbiased screen: `results/tables/trajectory_donor_aware_results.csv` (Supplementary Table S1).</w:t>
       </w:r>
     </w:p>
     <w:p>
@@ -452,7 +2969,25 @@
     </w:p>
     <w:p>
       <w:r>
-        <w:t>Pearson correlation between donor-aware scRNA-seq ρ and bulk T2D log₂FC across 18 GENCODE-confirmed, bulk-detectable loci was r=−0.647, p=0.0037. At the individual-gene level, AC020656.1 was upregulated in T2D blood (log₂FC=+0.75, FDR=0.017, tested against the pre-specified 20-candidate panel), with a progressive Control→Pre-DM→T2D pattern (Mann-Whitney p=8.2×10⁻⁴, independently reproduced via an ordinal Spearman trend test, ρ=0.235, p=0.001, and Kruskal-Wallis, p=0.004). An independent, genome-wide limma-voom reanalysis in R reproduced this effect size closely (log₂FC=+0.77, raw p=0.0033) but, tested against all 18,047 expressed genes rather than the pre-specified panel, did not reach genome-wide significance (FDR=0.28) — both values reflect the same underlying effect measured under different multiple-testing scopes, and both are reported here rather than only the more favorable one. MALAT1 showed no bulk change (p=0.891), consistent with its ubiquitous cross-cell-type expression diluting monocyte-subtype-specific signal in whole blood. A categorical concordance count (10/18 genes concordant, 55.6%) is, on its own, not distinguishable from chance (one-sided binomial p=0.41) and should not be cited as independent supporting evidence; the continuous Pearson correlation is the statistically meaningful metric.</w:t>
+        <w:t>Pearson correlation between donor-aware scRNA-seq ρ and bulk T2D log₂FC across 18 GENCODE-confirmed, bulk-detectable loci was r=−0.647, p=0.0037 (</w:t>
+      </w:r>
+      <w:r>
+        <w:rPr>
+          <w:b/>
+        </w:rPr>
+        <w:t>Fig. 4A–B</w:t>
+      </w:r>
+      <w:r>
+        <w:t>). At the individual-gene level, AC020656.1 was upregulated in T2D blood (log₂FC=+0.75, FDR=0.017, tested against the pre-specified 20-candidate panel), with a progressive Control→Pre-DM→T2D pattern (Mann-Whitney p=8.2×10⁻⁴, independently reproduced via an ordinal Spearman trend test, ρ=0.235, p=0.001, and Kruskal-Wallis, p=0.004) (</w:t>
+      </w:r>
+      <w:r>
+        <w:rPr>
+          <w:b/>
+        </w:rPr>
+        <w:t>Fig. 4C</w:t>
+      </w:r>
+      <w:r>
+        <w:t>). An independent, genome-wide limma-voom reanalysis in R reproduced this effect size closely (log₂FC=+0.77, raw p=0.0033) but, tested against all 18,047 expressed genes rather than the pre-specified panel, did not reach genome-wide significance (FDR=0.28) — both values reflect the same underlying effect measured under different multiple-testing scopes, and both are reported here rather than only the more favorable one. MALAT1 showed no bulk change (p=0.891), consistent with its ubiquitous cross-cell-type expression diluting monocyte-subtype-specific signal in whole blood. A categorical concordance count (10/18 genes concordant, 55.6%) is, on its own, not distinguishable from chance (one-sided binomial p=0.41) and should not be cited as independent supporting evidence; the continuous Pearson correlation is the statistically meaningful metric.</w:t>
       </w:r>
     </w:p>
     <w:p>
@@ -478,7 +3013,16 @@
     </w:p>
     <w:p>
       <w:r>
-        <w:t>GENCODE v32 places AC020656.1 (chr12:69,353,493–69,354,225, minus strand) completely within the genomic span of LYZ (chr12:69,348,341–69,354,234, plus strand): 100% of AC020656.1's gene body, and both of its exons, fall inside LYZ's terminal exon (exon-on-exon overlap, not intron) (Fig. 5, new). AC020656.1's sole GENCODE transcript (ENST00000548900.1) carries a transcript support level of 3, indicating moderate rather than the highest annotation confidence. Despite this complete nesting, AC020656.1 and LYZ are represented as two independently-tracked features with distinct Ensembl gene identifiers (ENSG00000257764 and ENSG00000090382, respectively) in the CellRanger feature reference used for this dataset, confirmed identically across all 10 sequenced samples.</w:t>
+        <w:t>GENCODE v32 places AC020656.1 (chr12:69,353,493–69,354,225, minus strand) completely within the genomic span of LYZ (chr12:69,348,341–69,354,234, plus strand): 100% of AC020656.1's gene body, and both of its exons, fall inside LYZ's terminal exon (exon-on-exon overlap, not intron) (</w:t>
+      </w:r>
+      <w:r>
+        <w:rPr>
+          <w:b/>
+        </w:rPr>
+        <w:t>Fig. 5</w:t>
+      </w:r>
+      <w:r>
+        <w:t>). AC020656.1's sole GENCODE transcript (ENST00000548900.1) carries a transcript support level of 3, indicating moderate rather than the highest annotation confidence. Despite this complete nesting, AC020656.1 and LYZ are represented as two independently-tracked features with distinct Ensembl gene identifiers (ENSG00000257764 and ENSG00000090382, respectively) in the CellRanger feature reference used for this dataset, confirmed identically across all 10 sequenced samples.</w:t>
       </w:r>
     </w:p>
     <w:p>
@@ -1296,6 +3840,596 @@
         <w:pStyle w:val="Heading1"/>
       </w:pPr>
       <w:r>
+        <w:t>Figure Legends</w:t>
+      </w:r>
+    </w:p>
+    <w:p>
+      <w:r>
+        <w:rPr>
+          <w:b/>
+        </w:rPr>
+        <w:t>Figure 1. T2D PBMC atlas and quality control.</w:t>
+      </w:r>
+    </w:p>
+    <w:p>
+      <w:pPr>
+        <w:jc w:val="center"/>
+      </w:pPr>
+      <w:r>
+        <w:drawing>
+          <wp:inline xmlns:a="http://schemas.openxmlformats.org/drawingml/2006/main" xmlns:pic="http://schemas.openxmlformats.org/drawingml/2006/picture">
+            <wp:extent cx="5760720" cy="1589109"/>
+            <wp:docPr id="1" name="Picture 1"/>
+            <wp:cNvGraphicFramePr>
+              <a:graphicFrameLocks noChangeAspect="1"/>
+            </wp:cNvGraphicFramePr>
+            <a:graphic>
+              <a:graphicData uri="http://schemas.openxmlformats.org/drawingml/2006/picture">
+                <pic:pic>
+                  <pic:nvPicPr>
+                    <pic:cNvPr id="0" name="Fig2_UMAP_overview.png"/>
+                    <pic:cNvPicPr/>
+                  </pic:nvPicPr>
+                  <pic:blipFill>
+                    <a:blip r:embed="rId9"/>
+                    <a:stretch>
+                      <a:fillRect/>
+                    </a:stretch>
+                  </pic:blipFill>
+                  <pic:spPr>
+                    <a:xfrm>
+                      <a:off x="0" y="0"/>
+                      <a:ext cx="5760720" cy="1589109"/>
+                    </a:xfrm>
+                    <a:prstGeom prst="rect"/>
+                  </pic:spPr>
+                </pic:pic>
+              </a:graphicData>
+            </a:graphic>
+          </wp:inline>
+        </w:drawing>
+      </w:r>
+    </w:p>
+    <w:p>
+      <w:pPr>
+        <w:jc w:val="center"/>
+      </w:pPr>
+      <w:r>
+        <w:rPr>
+          <w:i/>
+          <w:color w:val="444444"/>
+          <w:sz w:val="18"/>
+        </w:rPr>
+        <w:t>Figure 1A-B: UMAP of the full PBMC atlas</w:t>
+      </w:r>
+    </w:p>
+    <w:p>
+      <w:r>
+        <w:t>(A-B) UMAP of 209,289 T2D PBMCs across 9 donors, coloured by cell type (left), sample/donor (centre), and Leiden cluster (right). Batch mixing across donors is visually consistent with effective Harmony correction.</w:t>
+      </w:r>
+    </w:p>
+    <w:p>
+      <w:pPr>
+        <w:jc w:val="center"/>
+      </w:pPr>
+      <w:r>
+        <w:drawing>
+          <wp:inline xmlns:a="http://schemas.openxmlformats.org/drawingml/2006/main" xmlns:pic="http://schemas.openxmlformats.org/drawingml/2006/picture">
+            <wp:extent cx="5760720" cy="5466219"/>
+            <wp:docPr id="2" name="Picture 2"/>
+            <wp:cNvGraphicFramePr>
+              <a:graphicFrameLocks noChangeAspect="1"/>
+            </wp:cNvGraphicFramePr>
+            <a:graphic>
+              <a:graphicData uri="http://schemas.openxmlformats.org/drawingml/2006/picture">
+                <pic:pic>
+                  <pic:nvPicPr>
+                    <pic:cNvPr id="0" name="Fig1_QC_violins.png"/>
+                    <pic:cNvPicPr/>
+                  </pic:nvPicPr>
+                  <pic:blipFill>
+                    <a:blip r:embed="rId10"/>
+                    <a:stretch>
+                      <a:fillRect/>
+                    </a:stretch>
+                  </pic:blipFill>
+                  <pic:spPr>
+                    <a:xfrm>
+                      <a:off x="0" y="0"/>
+                      <a:ext cx="5760720" cy="5466219"/>
+                    </a:xfrm>
+                    <a:prstGeom prst="rect"/>
+                  </pic:spPr>
+                </pic:pic>
+              </a:graphicData>
+            </a:graphic>
+          </wp:inline>
+        </w:drawing>
+      </w:r>
+    </w:p>
+    <w:p>
+      <w:pPr>
+        <w:jc w:val="center"/>
+      </w:pPr>
+      <w:r>
+        <w:rPr>
+          <w:i/>
+          <w:color w:val="444444"/>
+          <w:sz w:val="18"/>
+        </w:rPr>
+        <w:t>Figure 1C: QC violin plots per donor</w:t>
+      </w:r>
+    </w:p>
+    <w:p>
+      <w:r>
+        <w:t>(C) Genes detected per cell, UMI counts, and mitochondrial percentage per donor, post-filtering.</w:t>
+      </w:r>
+    </w:p>
+    <w:p>
+      <w:r>
+        <w:t>____________________________________________________________</w:t>
+      </w:r>
+    </w:p>
+    <w:p>
+      <w:r>
+        <w:rPr>
+          <w:b/>
+        </w:rPr>
+        <w:t>Figure 2. Monocyte subtype organization, pseudotime, and branch-aware topology.</w:t>
+      </w:r>
+    </w:p>
+    <w:p>
+      <w:pPr>
+        <w:jc w:val="center"/>
+      </w:pPr>
+      <w:r>
+        <w:drawing>
+          <wp:inline xmlns:a="http://schemas.openxmlformats.org/drawingml/2006/main" xmlns:pic="http://schemas.openxmlformats.org/drawingml/2006/picture">
+            <wp:extent cx="5760720" cy="1593048"/>
+            <wp:docPr id="3" name="Picture 3"/>
+            <wp:cNvGraphicFramePr>
+              <a:graphicFrameLocks noChangeAspect="1"/>
+            </wp:cNvGraphicFramePr>
+            <a:graphic>
+              <a:graphicData uri="http://schemas.openxmlformats.org/drawingml/2006/picture">
+                <pic:pic>
+                  <pic:nvPicPr>
+                    <pic:cNvPr id="0" name="Fig9_pseudotime_final.png"/>
+                    <pic:cNvPicPr/>
+                  </pic:nvPicPr>
+                  <pic:blipFill>
+                    <a:blip r:embed="rId11"/>
+                    <a:stretch>
+                      <a:fillRect/>
+                    </a:stretch>
+                  </pic:blipFill>
+                  <pic:spPr>
+                    <a:xfrm>
+                      <a:off x="0" y="0"/>
+                      <a:ext cx="5760720" cy="1593048"/>
+                    </a:xfrm>
+                    <a:prstGeom prst="rect"/>
+                  </pic:spPr>
+                </pic:pic>
+              </a:graphicData>
+            </a:graphic>
+          </wp:inline>
+        </w:drawing>
+      </w:r>
+    </w:p>
+    <w:p>
+      <w:pPr>
+        <w:jc w:val="center"/>
+      </w:pPr>
+      <w:r>
+        <w:rPr>
+          <w:i/>
+          <w:color w:val="444444"/>
+          <w:sz w:val="18"/>
+        </w:rPr>
+        <w:t>Figure 2A-C: monocyte subtype UMAP and pseudotime</w:t>
+      </w:r>
+    </w:p>
+    <w:p>
+      <w:r>
+        <w:t>(A) UMAP of 44,057 monocytes coloured by subtype (CD14 Classical, Intermediate, CD16 Non-Classical). (B) The same UMAP coloured by diffusion pseudotime. (C) Pseudotime distribution per subtype (median values annotated); Intermediate monocytes show the highest, not an intermediate, pseudotime value.</w:t>
+      </w:r>
+    </w:p>
+    <w:p>
+      <w:pPr>
+        <w:jc w:val="center"/>
+      </w:pPr>
+      <w:r>
+        <w:drawing>
+          <wp:inline xmlns:a="http://schemas.openxmlformats.org/drawingml/2006/main" xmlns:pic="http://schemas.openxmlformats.org/drawingml/2006/picture">
+            <wp:extent cx="5760720" cy="6082423"/>
+            <wp:docPr id="4" name="Picture 4"/>
+            <wp:cNvGraphicFramePr>
+              <a:graphicFrameLocks noChangeAspect="1"/>
+            </wp:cNvGraphicFramePr>
+            <a:graphic>
+              <a:graphicData uri="http://schemas.openxmlformats.org/drawingml/2006/picture">
+                <pic:pic>
+                  <pic:nvPicPr>
+                    <pic:cNvPr id="0" name="Fig_paga_topology.png"/>
+                    <pic:cNvPicPr/>
+                  </pic:nvPicPr>
+                  <pic:blipFill>
+                    <a:blip r:embed="rId12"/>
+                    <a:stretch>
+                      <a:fillRect/>
+                    </a:stretch>
+                  </pic:blipFill>
+                  <pic:spPr>
+                    <a:xfrm>
+                      <a:off x="0" y="0"/>
+                      <a:ext cx="5760720" cy="6082423"/>
+                    </a:xfrm>
+                    <a:prstGeom prst="rect"/>
+                  </pic:spPr>
+                </pic:pic>
+              </a:graphicData>
+            </a:graphic>
+          </wp:inline>
+        </w:drawing>
+      </w:r>
+    </w:p>
+    <w:p>
+      <w:pPr>
+        <w:jc w:val="center"/>
+      </w:pPr>
+      <w:r>
+        <w:rPr>
+          <w:i/>
+          <w:color w:val="444444"/>
+          <w:sz w:val="18"/>
+        </w:rPr>
+        <w:t>Figure 2D: PAGA connectivity graph</w:t>
+      </w:r>
+    </w:p>
+    <w:p>
+      <w:r>
+        <w:t>(D) PAGA connectivity between the three monocyte subtypes. Edge thickness reflects connectivity strength; CD14↔CD16 (0.044) is more than three times stronger than CD14↔Intermediate (0.012), arguing against a strictly linear activation continuum.</w:t>
+      </w:r>
+    </w:p>
+    <w:p>
+      <w:r>
+        <w:t>____________________________________________________________</w:t>
+      </w:r>
+    </w:p>
+    <w:p>
+      <w:r>
+        <w:rPr>
+          <w:b/>
+        </w:rPr>
+        <w:t>Figure 3. Donor-aware trajectory-associated lncRNAs.</w:t>
+      </w:r>
+    </w:p>
+    <w:p>
+      <w:pPr>
+        <w:jc w:val="center"/>
+      </w:pPr>
+      <w:r>
+        <w:drawing>
+          <wp:inline xmlns:a="http://schemas.openxmlformats.org/drawingml/2006/main" xmlns:pic="http://schemas.openxmlformats.org/drawingml/2006/picture">
+            <wp:extent cx="5760720" cy="5001597"/>
+            <wp:docPr id="5" name="Picture 5"/>
+            <wp:cNvGraphicFramePr>
+              <a:graphicFrameLocks noChangeAspect="1"/>
+            </wp:cNvGraphicFramePr>
+            <a:graphic>
+              <a:graphicData uri="http://schemas.openxmlformats.org/drawingml/2006/picture">
+                <pic:pic>
+                  <pic:nvPicPr>
+                    <pic:cNvPr id="0" name="Fig10_trajectory_heatmap_final.png"/>
+                    <pic:cNvPicPr/>
+                  </pic:nvPicPr>
+                  <pic:blipFill>
+                    <a:blip r:embed="rId13"/>
+                    <a:stretch>
+                      <a:fillRect/>
+                    </a:stretch>
+                  </pic:blipFill>
+                  <pic:spPr>
+                    <a:xfrm>
+                      <a:off x="0" y="0"/>
+                      <a:ext cx="5760720" cy="5001597"/>
+                    </a:xfrm>
+                    <a:prstGeom prst="rect"/>
+                  </pic:spPr>
+                </pic:pic>
+              </a:graphicData>
+            </a:graphic>
+          </wp:inline>
+        </w:drawing>
+      </w:r>
+    </w:p>
+    <w:p>
+      <w:pPr>
+        <w:jc w:val="center"/>
+      </w:pPr>
+      <w:r>
+        <w:rPr>
+          <w:i/>
+          <w:color w:val="444444"/>
+          <w:sz w:val="18"/>
+        </w:rPr>
+        <w:t>Figure 3A: trajectory lncRNA heatmap</w:t>
+      </w:r>
+    </w:p>
+    <w:p>
+      <w:r>
+        <w:t>(A) Expression heatmap of trajectory-associated lncRNAs ordered by pseudotime, with subtype and pseudotime colour bars. Z-scored expression.</w:t>
+      </w:r>
+    </w:p>
+    <w:p>
+      <w:pPr>
+        <w:jc w:val="center"/>
+      </w:pPr>
+      <w:r>
+        <w:drawing>
+          <wp:inline xmlns:a="http://schemas.openxmlformats.org/drawingml/2006/main" xmlns:pic="http://schemas.openxmlformats.org/drawingml/2006/picture">
+            <wp:extent cx="5760720" cy="7561863"/>
+            <wp:docPr id="6" name="Picture 6"/>
+            <wp:cNvGraphicFramePr>
+              <a:graphicFrameLocks noChangeAspect="1"/>
+            </wp:cNvGraphicFramePr>
+            <a:graphic>
+              <a:graphicData uri="http://schemas.openxmlformats.org/drawingml/2006/picture">
+                <pic:pic>
+                  <pic:nvPicPr>
+                    <pic:cNvPr id="0" name="Fig10b_trajectory_lollipop_final.png"/>
+                    <pic:cNvPicPr/>
+                  </pic:nvPicPr>
+                  <pic:blipFill>
+                    <a:blip r:embed="rId14"/>
+                    <a:stretch>
+                      <a:fillRect/>
+                    </a:stretch>
+                  </pic:blipFill>
+                  <pic:spPr>
+                    <a:xfrm>
+                      <a:off x="0" y="0"/>
+                      <a:ext cx="5760720" cy="7561863"/>
+                    </a:xfrm>
+                    <a:prstGeom prst="rect"/>
+                  </pic:spPr>
+                </pic:pic>
+              </a:graphicData>
+            </a:graphic>
+          </wp:inline>
+        </w:drawing>
+      </w:r>
+    </w:p>
+    <w:p>
+      <w:pPr>
+        <w:jc w:val="center"/>
+      </w:pPr>
+      <w:r>
+        <w:rPr>
+          <w:i/>
+          <w:color w:val="444444"/>
+          <w:sz w:val="18"/>
+        </w:rPr>
+        <w:t>Figure 3B: trajectory lncRNA lollipop plot</w:t>
+      </w:r>
+    </w:p>
+    <w:p>
+      <w:r>
+        <w:t xml:space="preserve">(B) Lollipop plot of Spearman ρ for all significant loci from the initial pattern-based screen; donor-aware-confirmed effect sizes and directions for these loci are given in </w:t>
+      </w:r>
+      <w:r>
+        <w:rPr>
+          <w:b/>
+        </w:rPr>
+        <w:t>Table 1</w:t>
+      </w:r>
+      <w:r>
+        <w:t>.</w:t>
+      </w:r>
+    </w:p>
+    <w:p>
+      <w:r>
+        <w:t>____________________________________________________________</w:t>
+      </w:r>
+    </w:p>
+    <w:p>
+      <w:r>
+        <w:rPr>
+          <w:b/>
+        </w:rPr>
+        <w:t>Figure 4. Independent bulk validation (GSE221521).</w:t>
+      </w:r>
+    </w:p>
+    <w:p>
+      <w:pPr>
+        <w:jc w:val="center"/>
+      </w:pPr>
+      <w:r>
+        <w:drawing>
+          <wp:inline xmlns:a="http://schemas.openxmlformats.org/drawingml/2006/main" xmlns:pic="http://schemas.openxmlformats.org/drawingml/2006/picture">
+            <wp:extent cx="5760720" cy="5022682"/>
+            <wp:docPr id="7" name="Picture 7"/>
+            <wp:cNvGraphicFramePr>
+              <a:graphicFrameLocks noChangeAspect="1"/>
+            </wp:cNvGraphicFramePr>
+            <a:graphic>
+              <a:graphicData uri="http://schemas.openxmlformats.org/drawingml/2006/picture">
+                <pic:pic>
+                  <pic:nvPicPr>
+                    <pic:cNvPr id="0" name="Fig14_bulk_validation.png"/>
+                    <pic:cNvPicPr/>
+                  </pic:nvPicPr>
+                  <pic:blipFill>
+                    <a:blip r:embed="rId15"/>
+                    <a:stretch>
+                      <a:fillRect/>
+                    </a:stretch>
+                  </pic:blipFill>
+                  <pic:spPr>
+                    <a:xfrm>
+                      <a:off x="0" y="0"/>
+                      <a:ext cx="5760720" cy="5022682"/>
+                    </a:xfrm>
+                    <a:prstGeom prst="rect"/>
+                  </pic:spPr>
+                </pic:pic>
+              </a:graphicData>
+            </a:graphic>
+          </wp:inline>
+        </w:drawing>
+      </w:r>
+    </w:p>
+    <w:p>
+      <w:pPr>
+        <w:jc w:val="center"/>
+      </w:pPr>
+      <w:r>
+        <w:rPr>
+          <w:i/>
+          <w:color w:val="444444"/>
+          <w:sz w:val="18"/>
+        </w:rPr>
+        <w:t>Figure 4A-B: bulk validation concordance</w:t>
+      </w:r>
+    </w:p>
+    <w:p>
+      <w:r>
+        <w:t>(A) Scatter plot of donor-aware scRNA-seq ρ vs. bulk T2D log₂FC for 18 GENCODE-confirmed loci (Pearson r=−0.647, p=0.0037). (B) Categorical direction-concordance count (10/18, 55.6%) — shown for completeness; this statistic alone is not distinguishable from chance (binomial p=0.41) and the continuous correlation in panel A is the metric that carries statistical weight.</w:t>
+      </w:r>
+    </w:p>
+    <w:p>
+      <w:pPr>
+        <w:jc w:val="center"/>
+      </w:pPr>
+      <w:r>
+        <w:drawing>
+          <wp:inline xmlns:a="http://schemas.openxmlformats.org/drawingml/2006/main" xmlns:pic="http://schemas.openxmlformats.org/drawingml/2006/picture">
+            <wp:extent cx="5760720" cy="3286706"/>
+            <wp:docPr id="8" name="Picture 8"/>
+            <wp:cNvGraphicFramePr>
+              <a:graphicFrameLocks noChangeAspect="1"/>
+            </wp:cNvGraphicFramePr>
+            <a:graphic>
+              <a:graphicData uri="http://schemas.openxmlformats.org/drawingml/2006/picture">
+                <pic:pic>
+                  <pic:nvPicPr>
+                    <pic:cNvPr id="0" name="Fig15_key_lncrna_boxplots.png"/>
+                    <pic:cNvPicPr/>
+                  </pic:nvPicPr>
+                  <pic:blipFill>
+                    <a:blip r:embed="rId16"/>
+                    <a:stretch>
+                      <a:fillRect/>
+                    </a:stretch>
+                  </pic:blipFill>
+                  <pic:spPr>
+                    <a:xfrm>
+                      <a:off x="0" y="0"/>
+                      <a:ext cx="5760720" cy="3286706"/>
+                    </a:xfrm>
+                    <a:prstGeom prst="rect"/>
+                  </pic:spPr>
+                </pic:pic>
+              </a:graphicData>
+            </a:graphic>
+          </wp:inline>
+        </w:drawing>
+      </w:r>
+    </w:p>
+    <w:p>
+      <w:pPr>
+        <w:jc w:val="center"/>
+      </w:pPr>
+      <w:r>
+        <w:rPr>
+          <w:i/>
+          <w:color w:val="444444"/>
+          <w:sz w:val="18"/>
+        </w:rPr>
+        <w:t>Figure 4C: AC020656.1 and NEAT1 bulk expression</w:t>
+      </w:r>
+    </w:p>
+    <w:p>
+      <w:r>
+        <w:t>(C) AC020656.1 and NEAT1 expression across Control (n=50), Pre-DM (n=69), and T2D (n=74) bulk blood samples.</w:t>
+      </w:r>
+    </w:p>
+    <w:p>
+      <w:r>
+        <w:t>____________________________________________________________</w:t>
+      </w:r>
+    </w:p>
+    <w:p>
+      <w:r>
+        <w:rPr>
+          <w:b/>
+        </w:rPr>
+        <w:t>Figure 5. The AC020656.1 locus is fully nested within LYZ.</w:t>
+      </w:r>
+    </w:p>
+    <w:p>
+      <w:pPr>
+        <w:jc w:val="center"/>
+      </w:pPr>
+      <w:r>
+        <w:drawing>
+          <wp:inline xmlns:a="http://schemas.openxmlformats.org/drawingml/2006/main" xmlns:pic="http://schemas.openxmlformats.org/drawingml/2006/picture">
+            <wp:extent cx="5760720" cy="3200400"/>
+            <wp:docPr id="9" name="Picture 9"/>
+            <wp:cNvGraphicFramePr>
+              <a:graphicFrameLocks noChangeAspect="1"/>
+            </wp:cNvGraphicFramePr>
+            <a:graphic>
+              <a:graphicData uri="http://schemas.openxmlformats.org/drawingml/2006/picture">
+                <pic:pic>
+                  <pic:nvPicPr>
+                    <pic:cNvPr id="0" name="Fig_AC0206561_LYZ_locus.png"/>
+                    <pic:cNvPicPr/>
+                  </pic:nvPicPr>
+                  <pic:blipFill>
+                    <a:blip r:embed="rId17"/>
+                    <a:stretch>
+                      <a:fillRect/>
+                    </a:stretch>
+                  </pic:blipFill>
+                  <pic:spPr>
+                    <a:xfrm>
+                      <a:off x="0" y="0"/>
+                      <a:ext cx="5760720" cy="3200400"/>
+                    </a:xfrm>
+                    <a:prstGeom prst="rect"/>
+                  </pic:spPr>
+                </pic:pic>
+              </a:graphicData>
+            </a:graphic>
+          </wp:inline>
+        </w:drawing>
+      </w:r>
+    </w:p>
+    <w:p>
+      <w:pPr>
+        <w:jc w:val="center"/>
+      </w:pPr>
+      <w:r>
+        <w:rPr>
+          <w:i/>
+          <w:color w:val="444444"/>
+          <w:sz w:val="18"/>
+        </w:rPr>
+        <w:t>Figure 5: AC020656.1-LYZ genomic locus</w:t>
+      </w:r>
+    </w:p>
+    <w:p>
+      <w:r>
+        <w:t>Exact GENCODE v32 exon coordinates (chr12) for LYZ (3 transcripts, plus strand) and AC020656.1 (1 transcript, minus strand). Both AC020656.1 exons fall entirely within LYZ's terminal exon — a complete, exon-on-exon antisense overlap with no unique AC020656.1 sequence.</w:t>
+      </w:r>
+    </w:p>
+    <w:p>
+      <w:pPr>
+        <w:pStyle w:val="Heading1"/>
+      </w:pPr>
+      <w:r>
         <w:t>Supplementary Material</w:t>
       </w:r>
     </w:p>
@@ -1338,7 +4472,7 @@
         <w:t>Supplementary Figure S1</w:t>
       </w:r>
       <w:r>
-        <w:t>: QC violin plots and full PBMC UMAP.</w:t>
+        <w:t>: Donor-aware differential-state volcano plot, CD14 vs. CD16 (edgeR) (`FigE_CD14_vs_CD16_volcano.png`).</w:t>
       </w:r>
     </w:p>
     <w:p>
@@ -1352,7 +4486,7 @@
         <w:t>Supplementary Figure S2</w:t>
       </w:r>
       <w:r>
-        <w:t>: Donor-aware differential-state volcano plot (CD14 vs. CD16, edgeR).</w:t>
+        <w:t>: AC020656.1 per-donor forest plot, random-effects meta-analysis (`FigB_AC0206561_forest_plot.png`); AC020656.1 and NEAT1 per-donor correlation distributions (`Fig_AC0206561_correlation_distribution.png`, `Fig_NEAT1_correlation_distribution.png`); NEAT1 per-subtype expression profile (`FigD_NEAT1_subtype_profile.png`).</w:t>
       </w:r>
     </w:p>
     <w:p>
@@ -1366,7 +4500,7 @@
         <w:t>Supplementary Figure S3</w:t>
       </w:r>
       <w:r>
-        <w:t>: AC020656.1 and NEAT1 forest plots (per-donor effect estimates).</w:t>
+        <w:t>: AC020656.1-, NEAT1-, and CD14/CD16-state-associated Hallmark pathway enrichment (`FigG_fgsea_*.png`).</w:t>
       </w:r>
     </w:p>
     <w:p>
@@ -1380,7 +4514,7 @@
         <w:t>Supplementary Figure S4</w:t>
       </w:r>
       <w:r>
-        <w:t>: AC020656.1/NEAT1-associated Hallmark pathway enrichment.</w:t>
+        <w:t>: NNLS-estimated blood cell-type fractions by disease stage (`FigH_bulk_composition_fractions.png`), and AC020656.1/NEAT1 expression by bulk disease stage (`FigC_bulk_disease_stage.png`, `Figure_AC0206561_vs_LYZ_disease_stage.png`).</w:t>
       </w:r>
     </w:p>
     <w:p>
@@ -1394,7 +4528,7 @@
         <w:t>Supplementary Figure S5</w:t>
       </w:r>
       <w:r>
-        <w:t>: NNLS-estimated blood cell-type fractions by disease stage.</w:t>
+        <w:t>: AC020656.1 vs. LYZ pseudobulk scatter by donor and subtype (`FigA_AC0206561_donor_subtype.png`, `Figure1_AC0206561_vs_LYZ_donor_subtype.png`).</w:t>
       </w:r>
     </w:p>
     <w:p>
@@ -1408,7 +4542,21 @@
         <w:t>Supplementary Figure S6</w:t>
       </w:r>
       <w:r>
-        <w:t>: AC020656.1 vs. LYZ pseudobulk scatter by donor and subtype.</w:t>
+        <w:t>: Pattern-based (non-GENCODE-reverified) lncRNA cell-type-specificity atlas across all PBMC populations (`Fig13_lncrna_celltype_specificity.png`) — shown for exploratory context only; not used to support any Results claim.</w:t>
+      </w:r>
+    </w:p>
+    <w:p>
+      <w:pPr>
+        <w:pStyle w:val="ListBullet"/>
+      </w:pPr>
+      <w:r>
+        <w:rPr>
+          <w:b/>
+        </w:rPr>
+        <w:t>Supplementary Figure S7</w:t>
+      </w:r>
+      <w:r>
+        <w:t>: Pseudobulk QC — library sizes and cell counts per donor×subtype sample (`pseudobulk_library_sizes.png`, `pseudobulk_ncells_per_sample.png`).</w:t>
       </w:r>
     </w:p>
     <w:sectPr>

</xml_diff>